<commit_message>
Final commit for 1.0
</commit_message>
<xml_diff>
--- a/Additions_to_Protto_VD_software_1.0.docx
+++ b/Additions_to_Protto_VD_software_1.0.docx
@@ -1,6 +1,6 @@
 
 <file path=word/document.xml><?xml version="1.0" encoding="utf-8"?>
-<w:document xmlns:wpc="http://schemas.microsoft.com/office/word/2010/wordprocessingCanvas" xmlns:cx="http://schemas.microsoft.com/office/drawing/2014/chartex" xmlns:cx1="http://schemas.microsoft.com/office/drawing/2015/9/8/chartex" xmlns:cx2="http://schemas.microsoft.com/office/drawing/2015/10/21/chartex" xmlns:cx3="http://schemas.microsoft.com/office/drawing/2016/5/9/chartex" xmlns:cx4="http://schemas.microsoft.com/office/drawing/2016/5/10/chartex" xmlns:cx5="http://schemas.microsoft.com/office/drawing/2016/5/11/chartex" xmlns:cx6="http://schemas.microsoft.com/office/drawing/2016/5/12/chartex" xmlns:cx7="http://schemas.microsoft.com/office/drawing/2016/5/13/chartex" xmlns:cx8="http://schemas.microsoft.com/office/drawing/2016/5/14/chartex" xmlns:mc="http://schemas.openxmlformats.org/markup-compatibility/2006" xmlns:aink="http://schemas.microsoft.com/office/drawing/2016/ink" xmlns:am3d="http://schemas.microsoft.com/office/drawing/2017/model3d" xmlns:o="urn:schemas-microsoft-com:office:office" xmlns:oel="http://schemas.microsoft.com/office/2019/extlst" xmlns:r="http://schemas.openxmlformats.org/officeDocument/2006/relationships" xmlns:m="http://schemas.openxmlformats.org/officeDocument/2006/math" xmlns:v="urn:schemas-microsoft-com:vml" xmlns:wp14="http://schemas.microsoft.com/office/word/2010/wordprocessingDrawing" xmlns:wp="http://schemas.openxmlformats.org/drawingml/2006/wordprocessingDrawing" xmlns:w10="urn:schemas-microsoft-com:office:word" xmlns:w="http://schemas.openxmlformats.org/wordprocessingml/2006/main" xmlns:w14="http://schemas.microsoft.com/office/word/2010/wordml" xmlns:w15="http://schemas.microsoft.com/office/word/2012/wordml" xmlns:w16cei="http://schemas.microsoft.com/office/word/2026/wordml/cei" xmlns:w16cex="http://schemas.microsoft.com/office/word/2018/wordml/cex" xmlns:w16cid="http://schemas.microsoft.com/office/word/2016/wordml/cid" xmlns:w16="http://schemas.microsoft.com/office/word/2018/wordml" xmlns:w16du="http://schemas.microsoft.com/office/word/2023/wordml/word16du" xmlns:w16sdtdh="http://schemas.microsoft.com/office/word/2020/wordml/sdtdatahash" xmlns:w16sdtfl="http://schemas.microsoft.com/office/word/2024/wordml/sdtformatlock" xmlns:w16se="http://schemas.microsoft.com/office/word/2015/wordml/symex" xmlns:wpg="http://schemas.microsoft.com/office/word/2010/wordprocessingGroup" xmlns:wpi="http://schemas.microsoft.com/office/word/2010/wordprocessingInk" xmlns:wne="http://schemas.microsoft.com/office/word/2006/wordml" xmlns:wps="http://schemas.microsoft.com/office/word/2010/wordprocessingShape" mc:Ignorable="w14 w15 w16se w16cid w16 w16cex w16sdtdh w16sdtfl w16du wp14">
+<w:document xmlns:wpc="http://schemas.microsoft.com/office/word/2010/wordprocessingCanvas" xmlns:cx="http://schemas.microsoft.com/office/drawing/2014/chartex" xmlns:cx1="http://schemas.microsoft.com/office/drawing/2015/9/8/chartex" xmlns:cx2="http://schemas.microsoft.com/office/drawing/2015/10/21/chartex" xmlns:cx3="http://schemas.microsoft.com/office/drawing/2016/5/9/chartex" xmlns:cx4="http://schemas.microsoft.com/office/drawing/2016/5/10/chartex" xmlns:cx5="http://schemas.microsoft.com/office/drawing/2016/5/11/chartex" xmlns:cx6="http://schemas.microsoft.com/office/drawing/2016/5/12/chartex" xmlns:cx7="http://schemas.microsoft.com/office/drawing/2016/5/13/chartex" xmlns:cx8="http://schemas.microsoft.com/office/drawing/2016/5/14/chartex" xmlns:mc="http://schemas.openxmlformats.org/markup-compatibility/2006" xmlns:aink="http://schemas.microsoft.com/office/drawing/2016/ink" xmlns:am3d="http://schemas.microsoft.com/office/drawing/2017/model3d" xmlns:o="urn:schemas-microsoft-com:office:office" xmlns:oel="http://schemas.microsoft.com/office/2019/extlst" xmlns:r="http://schemas.openxmlformats.org/officeDocument/2006/relationships" xmlns:m="http://schemas.openxmlformats.org/officeDocument/2006/math" xmlns:v="urn:schemas-microsoft-com:vml" xmlns:wp14="http://schemas.microsoft.com/office/word/2010/wordprocessingDrawing" xmlns:wp="http://schemas.openxmlformats.org/drawingml/2006/wordprocessingDrawing" xmlns:w10="urn:schemas-microsoft-com:office:word" xmlns:w="http://schemas.openxmlformats.org/wordprocessingml/2006/main" xmlns:w14="http://schemas.microsoft.com/office/word/2010/wordml" xmlns:w15="http://schemas.microsoft.com/office/word/2012/wordml" xmlns:w16cex="http://schemas.microsoft.com/office/word/2018/wordml/cex" xmlns:w16cid="http://schemas.microsoft.com/office/word/2016/wordml/cid" xmlns:w16="http://schemas.microsoft.com/office/word/2018/wordml" xmlns:w16du="http://schemas.microsoft.com/office/word/2023/wordml/word16du" xmlns:w16sdtdh="http://schemas.microsoft.com/office/word/2020/wordml/sdtdatahash" xmlns:w16sdtfl="http://schemas.microsoft.com/office/word/2024/wordml/sdtformatlock" xmlns:w16se="http://schemas.microsoft.com/office/word/2015/wordml/symex" xmlns:wpg="http://schemas.microsoft.com/office/word/2010/wordprocessingGroup" xmlns:wpi="http://schemas.microsoft.com/office/word/2010/wordprocessingInk" xmlns:wne="http://schemas.microsoft.com/office/word/2006/wordml" xmlns:wps="http://schemas.microsoft.com/office/word/2010/wordprocessingShape" mc:Ignorable="w14 w15 w16se w16cid w16 w16cex w16sdtdh w16sdtfl w16du wp14">
   <w:body>
     <w:p>
       <w:pPr>
@@ -1496,14 +1496,7 @@
                         <w:rFonts w:ascii="Cambria Math" w:hAnsi="Cambria Math" w:cs="Arial"/>
                         <w:szCs w:val="24"/>
                       </w:rPr>
-                      <m:t>down</m:t>
-                    </m:r>
-                    <m:r>
-                      <w:rPr>
-                        <w:rFonts w:ascii="Cambria Math" w:hAnsi="Cambria Math" w:cs="Arial"/>
-                        <w:szCs w:val="24"/>
-                      </w:rPr>
-                      <m:t>,x</m:t>
+                      <m:t>down,x</m:t>
                     </m:r>
                   </m:sub>
                 </m:sSub>
@@ -1577,14 +1570,7 @@
                         <w:rFonts w:ascii="Cambria Math" w:hAnsi="Cambria Math" w:cs="Arial"/>
                         <w:szCs w:val="24"/>
                       </w:rPr>
-                      <m:t>down</m:t>
-                    </m:r>
-                    <m:r>
-                      <w:rPr>
-                        <w:rFonts w:ascii="Cambria Math" w:hAnsi="Cambria Math" w:cs="Arial"/>
-                        <w:szCs w:val="24"/>
-                      </w:rPr>
-                      <m:t>,y</m:t>
+                      <m:t>down,y</m:t>
                     </m:r>
                   </m:sub>
                 </m:sSub>
@@ -1611,21 +1597,7 @@
                 <w:rFonts w:cs="Arial"/>
                 <w:szCs w:val="24"/>
               </w:rPr>
-              <w:t>Aerodynamic downforce l</w:t>
-            </w:r>
-            <w:r>
-              <w:rPr>
-                <w:rFonts w:cs="Arial"/>
-                <w:szCs w:val="24"/>
-              </w:rPr>
-              <w:t>ateral</w:t>
-            </w:r>
-            <w:r>
-              <w:rPr>
-                <w:rFonts w:cs="Arial"/>
-                <w:szCs w:val="24"/>
-              </w:rPr>
-              <w:t xml:space="preserve"> distribution [%]</w:t>
+              <w:t>Aerodynamic downforce lateral distribution [%]</w:t>
             </w:r>
           </w:p>
         </w:tc>
@@ -1672,14 +1644,7 @@
                         <w:rFonts w:ascii="Cambria Math" w:hAnsi="Cambria Math" w:cs="Arial"/>
                         <w:szCs w:val="24"/>
                       </w:rPr>
-                      <m:t>d</m:t>
-                    </m:r>
-                    <m:r>
-                      <w:rPr>
-                        <w:rFonts w:ascii="Cambria Math" w:hAnsi="Cambria Math" w:cs="Arial"/>
-                        <w:szCs w:val="24"/>
-                      </w:rPr>
-                      <m:t>rag</m:t>
+                      <m:t>drag</m:t>
                     </m:r>
                   </m:sub>
                 </m:sSub>
@@ -1789,14 +1754,7 @@
                 <w:rFonts w:cs="Arial"/>
                 <w:szCs w:val="24"/>
               </w:rPr>
-              <w:t>Aerodynamic</w:t>
-            </w:r>
-            <w:r>
-              <w:rPr>
-                <w:rFonts w:cs="Arial"/>
-                <w:szCs w:val="24"/>
-              </w:rPr>
-              <w:t xml:space="preserve"> roll moment [Nm]</w:t>
+              <w:t>Aerodynamic roll moment [Nm]</w:t>
             </w:r>
           </w:p>
         </w:tc>
@@ -1879,14 +1837,7 @@
                 <w:rFonts w:cs="Arial"/>
                 <w:szCs w:val="24"/>
               </w:rPr>
-              <w:t>Aerodynamic</w:t>
-            </w:r>
-            <w:r>
-              <w:rPr>
-                <w:rFonts w:cs="Arial"/>
-                <w:szCs w:val="24"/>
-              </w:rPr>
-              <w:t xml:space="preserve"> pitch moment [Nm]</w:t>
+              <w:t>Aerodynamic pitch moment [Nm]</w:t>
             </w:r>
           </w:p>
         </w:tc>
@@ -1969,14 +1920,7 @@
                 <w:rFonts w:cs="Arial"/>
                 <w:szCs w:val="24"/>
               </w:rPr>
-              <w:t>Aerodynamic</w:t>
-            </w:r>
-            <w:r>
-              <w:rPr>
-                <w:rFonts w:cs="Arial"/>
-                <w:szCs w:val="24"/>
-              </w:rPr>
-              <w:t xml:space="preserve"> yaw moment [Nm]</w:t>
+              <w:t>Aerodynamic yaw moment [Nm]</w:t>
             </w:r>
           </w:p>
         </w:tc>
@@ -2050,14 +1994,7 @@
                 <w:rFonts w:cs="Arial"/>
                 <w:szCs w:val="24"/>
               </w:rPr>
-              <w:t>Aerodynamic</w:t>
-            </w:r>
-            <w:r>
-              <w:rPr>
-                <w:rFonts w:cs="Arial"/>
-                <w:szCs w:val="24"/>
-              </w:rPr>
-              <w:t xml:space="preserve"> downforce coefficient [-]</w:t>
+              <w:t>Aerodynamic downforce coefficient [-]</w:t>
             </w:r>
           </w:p>
         </w:tc>
@@ -2131,21 +2068,7 @@
                 <w:rFonts w:cs="Arial"/>
                 <w:szCs w:val="24"/>
               </w:rPr>
-              <w:t>Aerodynamic d</w:t>
-            </w:r>
-            <w:r>
-              <w:rPr>
-                <w:rFonts w:cs="Arial"/>
-                <w:szCs w:val="24"/>
-              </w:rPr>
-              <w:t>rag</w:t>
-            </w:r>
-            <w:r>
-              <w:rPr>
-                <w:rFonts w:cs="Arial"/>
-                <w:szCs w:val="24"/>
-              </w:rPr>
-              <w:t xml:space="preserve"> coefficient [-]</w:t>
+              <w:t>Aerodynamic drag coefficient [-]</w:t>
             </w:r>
           </w:p>
         </w:tc>
@@ -2219,21 +2142,7 @@
                 <w:rFonts w:cs="Arial"/>
                 <w:szCs w:val="24"/>
               </w:rPr>
-              <w:t xml:space="preserve">Aerodynamic </w:t>
-            </w:r>
-            <w:r>
-              <w:rPr>
-                <w:rFonts w:cs="Arial"/>
-                <w:szCs w:val="24"/>
-              </w:rPr>
-              <w:t>roll moment</w:t>
-            </w:r>
-            <w:r>
-              <w:rPr>
-                <w:rFonts w:cs="Arial"/>
-                <w:szCs w:val="24"/>
-              </w:rPr>
-              <w:t xml:space="preserve"> coefficient [-]</w:t>
+              <w:t>Aerodynamic roll moment coefficient [-]</w:t>
             </w:r>
           </w:p>
         </w:tc>
@@ -2307,21 +2216,7 @@
                 <w:rFonts w:cs="Arial"/>
                 <w:szCs w:val="24"/>
               </w:rPr>
-              <w:t xml:space="preserve">Aerodynamic </w:t>
-            </w:r>
-            <w:r>
-              <w:rPr>
-                <w:rFonts w:cs="Arial"/>
-                <w:szCs w:val="24"/>
-              </w:rPr>
-              <w:t>pitch moment</w:t>
-            </w:r>
-            <w:r>
-              <w:rPr>
-                <w:rFonts w:cs="Arial"/>
-                <w:szCs w:val="24"/>
-              </w:rPr>
-              <w:t xml:space="preserve"> coefficient [-]</w:t>
+              <w:t>Aerodynamic pitch moment coefficient [-]</w:t>
             </w:r>
           </w:p>
         </w:tc>
@@ -2395,21 +2290,7 @@
                 <w:rFonts w:cs="Arial"/>
                 <w:szCs w:val="24"/>
               </w:rPr>
-              <w:t xml:space="preserve">Aerodynamic </w:t>
-            </w:r>
-            <w:r>
-              <w:rPr>
-                <w:rFonts w:cs="Arial"/>
-                <w:szCs w:val="24"/>
-              </w:rPr>
-              <w:t>yaw moment</w:t>
-            </w:r>
-            <w:r>
-              <w:rPr>
-                <w:rFonts w:cs="Arial"/>
-                <w:szCs w:val="24"/>
-              </w:rPr>
-              <w:t xml:space="preserve"> coefficient [-]</w:t>
+              <w:t>Aerodynamic yaw moment coefficient [-]</w:t>
             </w:r>
           </w:p>
         </w:tc>
@@ -2680,13 +2561,7 @@
                       <w:rPr>
                         <w:rFonts w:ascii="Cambria Math" w:hAnsi="Cambria Math"/>
                       </w:rPr>
-                      <m:t>f</m:t>
-                    </m:r>
-                    <m:r>
-                      <w:rPr>
-                        <w:rFonts w:ascii="Cambria Math" w:hAnsi="Cambria Math"/>
-                      </w:rPr>
-                      <m:t>r</m:t>
+                      <m:t>fr</m:t>
                     </m:r>
                   </m:sub>
                 </m:sSub>
@@ -2713,21 +2588,7 @@
                 <w:rFonts w:cs="Arial"/>
                 <w:szCs w:val="24"/>
               </w:rPr>
-              <w:t xml:space="preserve">Front </w:t>
-            </w:r>
-            <w:r>
-              <w:rPr>
-                <w:rFonts w:cs="Arial"/>
-                <w:szCs w:val="24"/>
-              </w:rPr>
-              <w:t>right</w:t>
-            </w:r>
-            <w:r>
-              <w:rPr>
-                <w:rFonts w:cs="Arial"/>
-                <w:szCs w:val="24"/>
-              </w:rPr>
-              <w:t xml:space="preserve"> tire torque [Nm]</w:t>
+              <w:t>Front right tire torque [Nm]</w:t>
             </w:r>
           </w:p>
         </w:tc>
@@ -2771,13 +2632,7 @@
                       <w:rPr>
                         <w:rFonts w:ascii="Cambria Math" w:hAnsi="Cambria Math"/>
                       </w:rPr>
-                      <m:t>r</m:t>
-                    </m:r>
-                    <m:r>
-                      <w:rPr>
-                        <w:rFonts w:ascii="Cambria Math" w:hAnsi="Cambria Math"/>
-                      </w:rPr>
-                      <m:t>l</m:t>
+                      <m:t>rl</m:t>
                     </m:r>
                   </m:sub>
                 </m:sSub>
@@ -2804,14 +2659,7 @@
                 <w:rFonts w:cs="Arial"/>
                 <w:szCs w:val="24"/>
               </w:rPr>
-              <w:t>Rear</w:t>
-            </w:r>
-            <w:r>
-              <w:rPr>
-                <w:rFonts w:cs="Arial"/>
-                <w:szCs w:val="24"/>
-              </w:rPr>
-              <w:t xml:space="preserve"> left tire torque [Nm]</w:t>
+              <w:t>Rear left tire torque [Nm]</w:t>
             </w:r>
           </w:p>
         </w:tc>
@@ -2882,14 +2730,7 @@
                 <w:rFonts w:cs="Arial"/>
                 <w:szCs w:val="24"/>
               </w:rPr>
-              <w:t>Rear right</w:t>
-            </w:r>
-            <w:r>
-              <w:rPr>
-                <w:rFonts w:cs="Arial"/>
-                <w:szCs w:val="24"/>
-              </w:rPr>
-              <w:t xml:space="preserve"> tire torque [Nm]</w:t>
+              <w:t>Rear right tire torque [Nm]</w:t>
             </w:r>
           </w:p>
         </w:tc>
@@ -3004,13 +2845,7 @@
                       <w:rPr>
                         <w:rFonts w:ascii="Cambria Math" w:hAnsi="Cambria Math"/>
                       </w:rPr>
-                      <m:t>f</m:t>
-                    </m:r>
-                    <m:r>
-                      <w:rPr>
-                        <w:rFonts w:ascii="Cambria Math" w:hAnsi="Cambria Math"/>
-                      </w:rPr>
-                      <m:t>o</m:t>
+                      <m:t>fo</m:t>
                     </m:r>
                   </m:sub>
                 </m:sSub>
@@ -3037,35 +2872,7 @@
                 <w:rFonts w:cs="Arial"/>
                 <w:szCs w:val="24"/>
               </w:rPr>
-              <w:t xml:space="preserve">Front </w:t>
-            </w:r>
-            <w:r>
-              <w:rPr>
-                <w:rFonts w:cs="Arial"/>
-                <w:szCs w:val="24"/>
-              </w:rPr>
-              <w:t>outer</w:t>
-            </w:r>
-            <w:r>
-              <w:rPr>
-                <w:rFonts w:cs="Arial"/>
-                <w:szCs w:val="24"/>
-              </w:rPr>
-              <w:t xml:space="preserve"> </w:t>
-            </w:r>
-            <w:r>
-              <w:rPr>
-                <w:rFonts w:cs="Arial"/>
-                <w:szCs w:val="24"/>
-              </w:rPr>
-              <w:t xml:space="preserve">tire </w:t>
-            </w:r>
-            <w:r>
-              <w:rPr>
-                <w:rFonts w:cs="Arial"/>
-                <w:szCs w:val="24"/>
-              </w:rPr>
-              <w:t>angular speed [rad/s]</w:t>
+              <w:t>Front outer tire angular speed [rad/s]</w:t>
             </w:r>
           </w:p>
         </w:tc>
@@ -3109,13 +2916,7 @@
                       <w:rPr>
                         <w:rFonts w:ascii="Cambria Math" w:hAnsi="Cambria Math"/>
                       </w:rPr>
-                      <m:t>r</m:t>
-                    </m:r>
-                    <m:r>
-                      <w:rPr>
-                        <w:rFonts w:ascii="Cambria Math" w:hAnsi="Cambria Math"/>
-                      </w:rPr>
-                      <m:t>i</m:t>
+                      <m:t>ri</m:t>
                     </m:r>
                   </m:sub>
                 </m:sSub>
@@ -3142,28 +2943,7 @@
                 <w:rFonts w:cs="Arial"/>
                 <w:szCs w:val="24"/>
               </w:rPr>
-              <w:t>Rear</w:t>
-            </w:r>
-            <w:r>
-              <w:rPr>
-                <w:rFonts w:cs="Arial"/>
-                <w:szCs w:val="24"/>
-              </w:rPr>
-              <w:t xml:space="preserve"> inner </w:t>
-            </w:r>
-            <w:r>
-              <w:rPr>
-                <w:rFonts w:cs="Arial"/>
-                <w:szCs w:val="24"/>
-              </w:rPr>
-              <w:t xml:space="preserve">tire </w:t>
-            </w:r>
-            <w:r>
-              <w:rPr>
-                <w:rFonts w:cs="Arial"/>
-                <w:szCs w:val="24"/>
-              </w:rPr>
-              <w:t>angular speed [rad/s]</w:t>
+              <w:t>Rear inner tire angular speed [rad/s]</w:t>
             </w:r>
           </w:p>
         </w:tc>
@@ -3234,28 +3014,7 @@
                 <w:rFonts w:cs="Arial"/>
                 <w:szCs w:val="24"/>
               </w:rPr>
-              <w:t>Rear</w:t>
-            </w:r>
-            <w:r>
-              <w:rPr>
-                <w:rFonts w:cs="Arial"/>
-                <w:szCs w:val="24"/>
-              </w:rPr>
-              <w:t xml:space="preserve"> outer </w:t>
-            </w:r>
-            <w:r>
-              <w:rPr>
-                <w:rFonts w:cs="Arial"/>
-                <w:szCs w:val="24"/>
-              </w:rPr>
-              <w:t xml:space="preserve">tire </w:t>
-            </w:r>
-            <w:r>
-              <w:rPr>
-                <w:rFonts w:cs="Arial"/>
-                <w:szCs w:val="24"/>
-              </w:rPr>
-              <w:t>angular speed [rad/s]</w:t>
+              <w:t>Rear outer tire angular speed [rad/s]</w:t>
             </w:r>
           </w:p>
         </w:tc>
@@ -3299,13 +3058,7 @@
                       <w:rPr>
                         <w:rFonts w:ascii="Cambria Math" w:hAnsi="Cambria Math"/>
                       </w:rPr>
-                      <m:t>f</m:t>
-                    </m:r>
-                    <m:r>
-                      <w:rPr>
-                        <w:rFonts w:ascii="Cambria Math" w:hAnsi="Cambria Math"/>
-                      </w:rPr>
-                      <m:t>i</m:t>
+                      <m:t>fi</m:t>
                     </m:r>
                   </m:sub>
                 </m:sSub>
@@ -3332,35 +3085,7 @@
                 <w:rFonts w:cs="Arial"/>
                 <w:szCs w:val="24"/>
               </w:rPr>
-              <w:t xml:space="preserve">Front inner </w:t>
-            </w:r>
-            <w:r>
-              <w:rPr>
-                <w:rFonts w:cs="Arial"/>
-                <w:szCs w:val="24"/>
-              </w:rPr>
-              <w:t>tire slip ratio</w:t>
-            </w:r>
-            <w:r>
-              <w:rPr>
-                <w:rFonts w:cs="Arial"/>
-                <w:szCs w:val="24"/>
-              </w:rPr>
-              <w:t xml:space="preserve"> [</w:t>
-            </w:r>
-            <w:r>
-              <w:rPr>
-                <w:rFonts w:cs="Arial"/>
-                <w:szCs w:val="24"/>
-              </w:rPr>
-              <w:t>%</w:t>
-            </w:r>
-            <w:r>
-              <w:rPr>
-                <w:rFonts w:cs="Arial"/>
-                <w:szCs w:val="24"/>
-              </w:rPr>
-              <w:t>]</w:t>
+              <w:t>Front inner tire slip ratio [%]</w:t>
             </w:r>
           </w:p>
         </w:tc>
@@ -3431,35 +3156,7 @@
                 <w:rFonts w:cs="Arial"/>
                 <w:szCs w:val="24"/>
               </w:rPr>
-              <w:t xml:space="preserve">Front outer </w:t>
-            </w:r>
-            <w:r>
-              <w:rPr>
-                <w:rFonts w:cs="Arial"/>
-                <w:szCs w:val="24"/>
-              </w:rPr>
-              <w:t>tire slip ratio</w:t>
-            </w:r>
-            <w:r>
-              <w:rPr>
-                <w:rFonts w:cs="Arial"/>
-                <w:szCs w:val="24"/>
-              </w:rPr>
-              <w:t xml:space="preserve"> [</w:t>
-            </w:r>
-            <w:r>
-              <w:rPr>
-                <w:rFonts w:cs="Arial"/>
-                <w:szCs w:val="24"/>
-              </w:rPr>
-              <w:t>%</w:t>
-            </w:r>
-            <w:r>
-              <w:rPr>
-                <w:rFonts w:cs="Arial"/>
-                <w:szCs w:val="24"/>
-              </w:rPr>
-              <w:t>]</w:t>
+              <w:t>Front outer tire slip ratio [%]</w:t>
             </w:r>
           </w:p>
         </w:tc>
@@ -3530,35 +3227,7 @@
                 <w:rFonts w:cs="Arial"/>
                 <w:szCs w:val="24"/>
               </w:rPr>
-              <w:t xml:space="preserve">Rear inner </w:t>
-            </w:r>
-            <w:r>
-              <w:rPr>
-                <w:rFonts w:cs="Arial"/>
-                <w:szCs w:val="24"/>
-              </w:rPr>
-              <w:t>tire slip ratio</w:t>
-            </w:r>
-            <w:r>
-              <w:rPr>
-                <w:rFonts w:cs="Arial"/>
-                <w:szCs w:val="24"/>
-              </w:rPr>
-              <w:t xml:space="preserve"> [</w:t>
-            </w:r>
-            <w:r>
-              <w:rPr>
-                <w:rFonts w:cs="Arial"/>
-                <w:szCs w:val="24"/>
-              </w:rPr>
-              <w:t>%</w:t>
-            </w:r>
-            <w:r>
-              <w:rPr>
-                <w:rFonts w:cs="Arial"/>
-                <w:szCs w:val="24"/>
-              </w:rPr>
-              <w:t>]</w:t>
+              <w:t>Rear inner tire slip ratio [%]</w:t>
             </w:r>
           </w:p>
         </w:tc>
@@ -3602,13 +3271,7 @@
                       <w:rPr>
                         <w:rFonts w:ascii="Cambria Math" w:hAnsi="Cambria Math"/>
                       </w:rPr>
-                      <m:t>r</m:t>
-                    </m:r>
-                    <m:r>
-                      <w:rPr>
-                        <w:rFonts w:ascii="Cambria Math" w:hAnsi="Cambria Math"/>
-                      </w:rPr>
-                      <m:t>o</m:t>
+                      <m:t>ro</m:t>
                     </m:r>
                   </m:sub>
                 </m:sSub>
@@ -3635,35 +3298,7 @@
                 <w:rFonts w:cs="Arial"/>
                 <w:szCs w:val="24"/>
               </w:rPr>
-              <w:t xml:space="preserve">Rear outer </w:t>
-            </w:r>
-            <w:r>
-              <w:rPr>
-                <w:rFonts w:cs="Arial"/>
-                <w:szCs w:val="24"/>
-              </w:rPr>
-              <w:t>tire slip ratio</w:t>
-            </w:r>
-            <w:r>
-              <w:rPr>
-                <w:rFonts w:cs="Arial"/>
-                <w:szCs w:val="24"/>
-              </w:rPr>
-              <w:t xml:space="preserve"> [</w:t>
-            </w:r>
-            <w:r>
-              <w:rPr>
-                <w:rFonts w:cs="Arial"/>
-                <w:szCs w:val="24"/>
-              </w:rPr>
-              <w:t>%</w:t>
-            </w:r>
-            <w:r>
-              <w:rPr>
-                <w:rFonts w:cs="Arial"/>
-                <w:szCs w:val="24"/>
-              </w:rPr>
-              <w:t>]</w:t>
+              <w:t>Rear outer tire slip ratio [%]</w:t>
             </w:r>
           </w:p>
         </w:tc>
@@ -3707,13 +3342,7 @@
                       <w:rPr>
                         <w:rFonts w:ascii="Cambria Math" w:hAnsi="Cambria Math"/>
                       </w:rPr>
-                      <m:t>x, f</m:t>
-                    </m:r>
-                    <m:r>
-                      <w:rPr>
-                        <w:rFonts w:ascii="Cambria Math" w:hAnsi="Cambria Math"/>
-                      </w:rPr>
-                      <m:t>i</m:t>
+                      <m:t>x, fi</m:t>
                     </m:r>
                   </m:sub>
                 </m:sSub>
@@ -3855,13 +3484,7 @@
                       <w:rPr>
                         <w:rFonts w:ascii="Cambria Math" w:hAnsi="Cambria Math"/>
                       </w:rPr>
-                      <m:t xml:space="preserve">x, </m:t>
-                    </m:r>
-                    <m:r>
-                      <w:rPr>
-                        <w:rFonts w:ascii="Cambria Math" w:hAnsi="Cambria Math"/>
-                      </w:rPr>
-                      <m:t>ri</m:t>
+                      <m:t>x, ri</m:t>
                     </m:r>
                   </m:sub>
                 </m:sSub>
@@ -3932,19 +3555,7 @@
                       <w:rPr>
                         <w:rFonts w:ascii="Cambria Math" w:hAnsi="Cambria Math"/>
                       </w:rPr>
-                      <m:t xml:space="preserve">x, </m:t>
-                    </m:r>
-                    <m:r>
-                      <w:rPr>
-                        <w:rFonts w:ascii="Cambria Math" w:hAnsi="Cambria Math"/>
-                      </w:rPr>
-                      <m:t>r</m:t>
-                    </m:r>
-                    <m:r>
-                      <w:rPr>
-                        <w:rFonts w:ascii="Cambria Math" w:hAnsi="Cambria Math"/>
-                      </w:rPr>
-                      <m:t>o</m:t>
+                      <m:t>x, ro</m:t>
                     </m:r>
                   </m:sub>
                 </m:sSub>
@@ -4042,35 +3653,7 @@
                 <w:rFonts w:cs="Arial"/>
                 <w:szCs w:val="24"/>
               </w:rPr>
-              <w:t xml:space="preserve">Front inner tire </w:t>
-            </w:r>
-            <w:r>
-              <w:rPr>
-                <w:rFonts w:cs="Arial"/>
-                <w:szCs w:val="24"/>
-              </w:rPr>
-              <w:t>radius</w:t>
-            </w:r>
-            <w:r>
-              <w:rPr>
-                <w:rFonts w:cs="Arial"/>
-                <w:szCs w:val="24"/>
-              </w:rPr>
-              <w:t xml:space="preserve"> [</w:t>
-            </w:r>
-            <w:r>
-              <w:rPr>
-                <w:rFonts w:cs="Arial"/>
-                <w:szCs w:val="24"/>
-              </w:rPr>
-              <w:t>m</w:t>
-            </w:r>
-            <w:r>
-              <w:rPr>
-                <w:rFonts w:cs="Arial"/>
-                <w:szCs w:val="24"/>
-              </w:rPr>
-              <w:t>]</w:t>
+              <w:t>Front inner tire radius [m]</w:t>
             </w:r>
           </w:p>
         </w:tc>
@@ -4114,13 +3697,7 @@
                       <w:rPr>
                         <w:rFonts w:ascii="Cambria Math" w:hAnsi="Cambria Math"/>
                       </w:rPr>
-                      <m:t>f</m:t>
-                    </m:r>
-                    <m:r>
-                      <w:rPr>
-                        <w:rFonts w:ascii="Cambria Math" w:hAnsi="Cambria Math"/>
-                      </w:rPr>
-                      <m:t>o</m:t>
+                      <m:t>fo</m:t>
                     </m:r>
                   </m:sub>
                 </m:sSub>
@@ -4191,13 +3768,7 @@
                       <w:rPr>
                         <w:rFonts w:ascii="Cambria Math" w:hAnsi="Cambria Math"/>
                       </w:rPr>
-                      <m:t>r</m:t>
-                    </m:r>
-                    <m:r>
-                      <w:rPr>
-                        <w:rFonts w:ascii="Cambria Math" w:hAnsi="Cambria Math"/>
-                      </w:rPr>
-                      <m:t>i</m:t>
+                      <m:t>ri</m:t>
                     </m:r>
                   </m:sub>
                 </m:sSub>
@@ -4453,14 +4024,7 @@
                 <w:rFonts w:cs="Arial"/>
                 <w:szCs w:val="24"/>
               </w:rPr>
-              <w:t>Rear</w:t>
-            </w:r>
-            <w:r>
-              <w:rPr>
-                <w:rFonts w:cs="Arial"/>
-                <w:szCs w:val="24"/>
-              </w:rPr>
-              <w:t xml:space="preserve"> differential drive torque bias ratio [-]</w:t>
+              <w:t>Rear differential drive torque bias ratio [-]</w:t>
             </w:r>
           </w:p>
         </w:tc>
@@ -4539,21 +4103,7 @@
                 <w:rFonts w:cs="Arial"/>
                 <w:szCs w:val="24"/>
               </w:rPr>
-              <w:t xml:space="preserve">Front differential </w:t>
-            </w:r>
-            <w:r>
-              <w:rPr>
-                <w:rFonts w:cs="Arial"/>
-                <w:szCs w:val="24"/>
-              </w:rPr>
-              <w:t>brake</w:t>
-            </w:r>
-            <w:r>
-              <w:rPr>
-                <w:rFonts w:cs="Arial"/>
-                <w:szCs w:val="24"/>
-              </w:rPr>
-              <w:t xml:space="preserve"> torque bias ratio [-]</w:t>
+              <w:t>Front differential brake torque bias ratio [-]</w:t>
             </w:r>
           </w:p>
         </w:tc>
@@ -4632,21 +4182,7 @@
                 <w:rFonts w:cs="Arial"/>
                 <w:szCs w:val="24"/>
               </w:rPr>
-              <w:t xml:space="preserve">Rear differential </w:t>
-            </w:r>
-            <w:r>
-              <w:rPr>
-                <w:rFonts w:cs="Arial"/>
-                <w:szCs w:val="24"/>
-              </w:rPr>
-              <w:t>brake</w:t>
-            </w:r>
-            <w:r>
-              <w:rPr>
-                <w:rFonts w:cs="Arial"/>
-                <w:szCs w:val="24"/>
-              </w:rPr>
-              <w:t xml:space="preserve"> torque bias ratio [-]</w:t>
+              <w:t>Rear differential brake torque bias ratio [-]</w:t>
             </w:r>
           </w:p>
         </w:tc>
@@ -4822,14 +4358,7 @@
                 <w:rFonts w:cs="Arial"/>
                 <w:szCs w:val="24"/>
               </w:rPr>
-              <w:t>Rear</w:t>
-            </w:r>
-            <w:r>
-              <w:rPr>
-                <w:rFonts w:cs="Arial"/>
-                <w:szCs w:val="24"/>
-              </w:rPr>
-              <w:t xml:space="preserve"> axle slipping torque difference [Nm]</w:t>
+              <w:t>Rear axle slipping torque difference [Nm]</w:t>
             </w:r>
           </w:p>
         </w:tc>
@@ -4917,21 +4446,7 @@
                 <w:rFonts w:cs="Arial"/>
                 <w:szCs w:val="24"/>
               </w:rPr>
-              <w:t xml:space="preserve">Front axle </w:t>
-            </w:r>
-            <w:r>
-              <w:rPr>
-                <w:rFonts w:cs="Arial"/>
-                <w:szCs w:val="24"/>
-              </w:rPr>
-              <w:t>locked</w:t>
-            </w:r>
-            <w:r>
-              <w:rPr>
-                <w:rFonts w:cs="Arial"/>
-                <w:szCs w:val="24"/>
-              </w:rPr>
-              <w:t xml:space="preserve"> torque difference [Nm]</w:t>
+              <w:t>Front axle locked torque difference [Nm]</w:t>
             </w:r>
           </w:p>
         </w:tc>
@@ -5019,21 +4534,7 @@
                 <w:rFonts w:cs="Arial"/>
                 <w:szCs w:val="24"/>
               </w:rPr>
-              <w:t xml:space="preserve">Rear axle </w:t>
-            </w:r>
-            <w:r>
-              <w:rPr>
-                <w:rFonts w:cs="Arial"/>
-                <w:szCs w:val="24"/>
-              </w:rPr>
-              <w:t>locked</w:t>
-            </w:r>
-            <w:r>
-              <w:rPr>
-                <w:rFonts w:cs="Arial"/>
-                <w:szCs w:val="24"/>
-              </w:rPr>
-              <w:t xml:space="preserve"> torque difference [Nm]</w:t>
+              <w:t>Rear axle locked torque difference [Nm]</w:t>
             </w:r>
           </w:p>
         </w:tc>
@@ -5113,21 +4614,7 @@
                 <w:rFonts w:cs="Arial"/>
                 <w:szCs w:val="24"/>
               </w:rPr>
-              <w:t>Front axle</w:t>
-            </w:r>
-            <w:r>
-              <w:rPr>
-                <w:rFonts w:cs="Arial"/>
-                <w:szCs w:val="24"/>
-              </w:rPr>
-              <w:t xml:space="preserve"> </w:t>
-            </w:r>
-            <w:r>
-              <w:rPr>
-                <w:rFonts w:cs="Arial"/>
-                <w:szCs w:val="24"/>
-              </w:rPr>
-              <w:t>torque difference [Nm]</w:t>
+              <w:t>Front axle torque difference [Nm]</w:t>
             </w:r>
           </w:p>
         </w:tc>
@@ -5348,21 +4835,7 @@
                 <w:rFonts w:cs="Arial"/>
                 <w:szCs w:val="24"/>
               </w:rPr>
-              <w:t>Rear</w:t>
-            </w:r>
-            <w:r>
-              <w:rPr>
-                <w:rFonts w:cs="Arial"/>
-                <w:szCs w:val="24"/>
-              </w:rPr>
-              <w:t xml:space="preserve"> differential preload</w:t>
-            </w:r>
-            <w:r>
-              <w:rPr>
-                <w:rFonts w:cs="Arial"/>
-                <w:szCs w:val="24"/>
-              </w:rPr>
-              <w:t xml:space="preserve"> [Nm]</w:t>
+              <w:t>Rear differential preload [Nm]</w:t>
             </w:r>
           </w:p>
         </w:tc>
@@ -5536,14 +5009,7 @@
                 <w:rFonts w:cs="Arial"/>
                 <w:szCs w:val="24"/>
               </w:rPr>
-              <w:t>Rear</w:t>
-            </w:r>
-            <w:r>
-              <w:rPr>
-                <w:rFonts w:cs="Arial"/>
-                <w:szCs w:val="24"/>
-              </w:rPr>
-              <w:t xml:space="preserve"> differential </w:t>
+              <w:t xml:space="preserve">Rear differential </w:t>
             </w:r>
             <w:proofErr w:type="spellStart"/>
             <w:r>
@@ -5939,14 +5405,7 @@
                         <w:rFonts w:ascii="Cambria Math" w:hAnsi="Cambria Math" w:cs="Arial"/>
                         <w:szCs w:val="24"/>
                       </w:rPr>
-                      <m:t>x,comb,f</m:t>
-                    </m:r>
-                    <m:r>
-                      <w:rPr>
-                        <w:rFonts w:ascii="Cambria Math" w:hAnsi="Cambria Math" w:cs="Arial"/>
-                        <w:szCs w:val="24"/>
-                      </w:rPr>
-                      <m:t>r</m:t>
+                      <m:t>x,comb,fr</m:t>
                     </m:r>
                   </m:sub>
                 </m:sSub>
@@ -5973,21 +5432,7 @@
                 <w:rFonts w:cs="Arial"/>
                 <w:szCs w:val="24"/>
               </w:rPr>
-              <w:t xml:space="preserve">Front </w:t>
-            </w:r>
-            <w:r>
-              <w:rPr>
-                <w:rFonts w:cs="Arial"/>
-                <w:szCs w:val="24"/>
-              </w:rPr>
-              <w:t>right</w:t>
-            </w:r>
-            <w:r>
-              <w:rPr>
-                <w:rFonts w:cs="Arial"/>
-                <w:szCs w:val="24"/>
-              </w:rPr>
-              <w:t xml:space="preserve"> tire combined longitudinal force [N]</w:t>
+              <w:t>Front right tire combined longitudinal force [N]</w:t>
             </w:r>
           </w:p>
         </w:tc>
@@ -6034,21 +5479,7 @@
                         <w:rFonts w:ascii="Cambria Math" w:hAnsi="Cambria Math" w:cs="Arial"/>
                         <w:szCs w:val="24"/>
                       </w:rPr>
-                      <m:t>x,comb,</m:t>
-                    </m:r>
-                    <m:r>
-                      <w:rPr>
-                        <w:rFonts w:ascii="Cambria Math" w:hAnsi="Cambria Math" w:cs="Arial"/>
-                        <w:szCs w:val="24"/>
-                      </w:rPr>
-                      <m:t>r</m:t>
-                    </m:r>
-                    <m:r>
-                      <w:rPr>
-                        <w:rFonts w:ascii="Cambria Math" w:hAnsi="Cambria Math" w:cs="Arial"/>
-                        <w:szCs w:val="24"/>
-                      </w:rPr>
-                      <m:t>l</m:t>
+                      <m:t>x,comb,rl</m:t>
                     </m:r>
                   </m:sub>
                 </m:sSub>
@@ -6075,14 +5506,7 @@
                 <w:rFonts w:cs="Arial"/>
                 <w:szCs w:val="24"/>
               </w:rPr>
-              <w:t>Rear</w:t>
-            </w:r>
-            <w:r>
-              <w:rPr>
-                <w:rFonts w:cs="Arial"/>
-                <w:szCs w:val="24"/>
-              </w:rPr>
-              <w:t xml:space="preserve"> left tire combined longitudinal force [N]</w:t>
+              <w:t>Rear left tire combined longitudinal force [N]</w:t>
             </w:r>
           </w:p>
         </w:tc>
@@ -6129,14 +5553,7 @@
                         <w:rFonts w:ascii="Cambria Math" w:hAnsi="Cambria Math" w:cs="Arial"/>
                         <w:szCs w:val="24"/>
                       </w:rPr>
-                      <m:t>x,comb,</m:t>
-                    </m:r>
-                    <m:r>
-                      <w:rPr>
-                        <w:rFonts w:ascii="Cambria Math" w:hAnsi="Cambria Math" w:cs="Arial"/>
-                        <w:szCs w:val="24"/>
-                      </w:rPr>
-                      <m:t>rr</m:t>
+                      <m:t>x,comb,rr</m:t>
                     </m:r>
                   </m:sub>
                 </m:sSub>
@@ -6163,14 +5580,7 @@
                 <w:rFonts w:cs="Arial"/>
                 <w:szCs w:val="24"/>
               </w:rPr>
-              <w:t>Rear right</w:t>
-            </w:r>
-            <w:r>
-              <w:rPr>
-                <w:rFonts w:cs="Arial"/>
-                <w:szCs w:val="24"/>
-              </w:rPr>
-              <w:t xml:space="preserve"> tire combined longitudinal force [N]</w:t>
+              <w:t>Rear right tire combined longitudinal force [N]</w:t>
             </w:r>
           </w:p>
         </w:tc>
@@ -6244,21 +5654,7 @@
                 <w:rFonts w:cs="Arial"/>
                 <w:szCs w:val="24"/>
               </w:rPr>
-              <w:t>Front left tire combined l</w:t>
-            </w:r>
-            <w:r>
-              <w:rPr>
-                <w:rFonts w:cs="Arial"/>
-                <w:szCs w:val="24"/>
-              </w:rPr>
-              <w:t>ateral</w:t>
-            </w:r>
-            <w:r>
-              <w:rPr>
-                <w:rFonts w:cs="Arial"/>
-                <w:szCs w:val="24"/>
-              </w:rPr>
-              <w:t xml:space="preserve"> force [N]</w:t>
+              <w:t>Front left tire combined lateral force [N]</w:t>
             </w:r>
           </w:p>
         </w:tc>
@@ -6305,14 +5701,7 @@
                         <w:rFonts w:ascii="Cambria Math" w:hAnsi="Cambria Math" w:cs="Arial"/>
                         <w:szCs w:val="24"/>
                       </w:rPr>
-                      <m:t>y,comb,f</m:t>
-                    </m:r>
-                    <m:r>
-                      <w:rPr>
-                        <w:rFonts w:ascii="Cambria Math" w:hAnsi="Cambria Math" w:cs="Arial"/>
-                        <w:szCs w:val="24"/>
-                      </w:rPr>
-                      <m:t>r</m:t>
+                      <m:t>y,comb,fr</m:t>
                     </m:r>
                   </m:sub>
                 </m:sSub>
@@ -6339,21 +5728,7 @@
                 <w:rFonts w:cs="Arial"/>
                 <w:szCs w:val="24"/>
               </w:rPr>
-              <w:t>Front right tire combined l</w:t>
-            </w:r>
-            <w:r>
-              <w:rPr>
-                <w:rFonts w:cs="Arial"/>
-                <w:szCs w:val="24"/>
-              </w:rPr>
-              <w:t>ateral</w:t>
-            </w:r>
-            <w:r>
-              <w:rPr>
-                <w:rFonts w:cs="Arial"/>
-                <w:szCs w:val="24"/>
-              </w:rPr>
-              <w:t xml:space="preserve"> force [N]</w:t>
+              <w:t>Front right tire combined lateral force [N]</w:t>
             </w:r>
           </w:p>
         </w:tc>
@@ -6400,21 +5775,7 @@
                         <w:rFonts w:ascii="Cambria Math" w:hAnsi="Cambria Math" w:cs="Arial"/>
                         <w:szCs w:val="24"/>
                       </w:rPr>
-                      <m:t>y,comb,</m:t>
-                    </m:r>
-                    <m:r>
-                      <w:rPr>
-                        <w:rFonts w:ascii="Cambria Math" w:hAnsi="Cambria Math" w:cs="Arial"/>
-                        <w:szCs w:val="24"/>
-                      </w:rPr>
-                      <m:t>r</m:t>
-                    </m:r>
-                    <m:r>
-                      <w:rPr>
-                        <w:rFonts w:ascii="Cambria Math" w:hAnsi="Cambria Math" w:cs="Arial"/>
-                        <w:szCs w:val="24"/>
-                      </w:rPr>
-                      <m:t>l</m:t>
+                      <m:t>y,comb,rl</m:t>
                     </m:r>
                   </m:sub>
                 </m:sSub>
@@ -6441,21 +5802,7 @@
                 <w:rFonts w:cs="Arial"/>
                 <w:szCs w:val="24"/>
               </w:rPr>
-              <w:t>Rear left tire combined l</w:t>
-            </w:r>
-            <w:r>
-              <w:rPr>
-                <w:rFonts w:cs="Arial"/>
-                <w:szCs w:val="24"/>
-              </w:rPr>
-              <w:t>ateral</w:t>
-            </w:r>
-            <w:r>
-              <w:rPr>
-                <w:rFonts w:cs="Arial"/>
-                <w:szCs w:val="24"/>
-              </w:rPr>
-              <w:t xml:space="preserve"> force [N]</w:t>
+              <w:t>Rear left tire combined lateral force [N]</w:t>
             </w:r>
           </w:p>
         </w:tc>
@@ -6502,14 +5849,7 @@
                         <w:rFonts w:ascii="Cambria Math" w:hAnsi="Cambria Math" w:cs="Arial"/>
                         <w:szCs w:val="24"/>
                       </w:rPr>
-                      <m:t>y,comb,</m:t>
-                    </m:r>
-                    <m:r>
-                      <w:rPr>
-                        <w:rFonts w:ascii="Cambria Math" w:hAnsi="Cambria Math" w:cs="Arial"/>
-                        <w:szCs w:val="24"/>
-                      </w:rPr>
-                      <m:t>rr</m:t>
+                      <m:t>y,comb,rr</m:t>
                     </m:r>
                   </m:sub>
                 </m:sSub>
@@ -6536,21 +5876,7 @@
                 <w:rFonts w:cs="Arial"/>
                 <w:szCs w:val="24"/>
               </w:rPr>
-              <w:t>Rear right tire combined l</w:t>
-            </w:r>
-            <w:r>
-              <w:rPr>
-                <w:rFonts w:cs="Arial"/>
-                <w:szCs w:val="24"/>
-              </w:rPr>
-              <w:t>ateral</w:t>
-            </w:r>
-            <w:r>
-              <w:rPr>
-                <w:rFonts w:cs="Arial"/>
-                <w:szCs w:val="24"/>
-              </w:rPr>
-              <w:t xml:space="preserve"> force [N]</w:t>
+              <w:t>Rear right tire combined lateral force [N]</w:t>
             </w:r>
           </w:p>
         </w:tc>
@@ -6624,21 +5950,7 @@
                 <w:rFonts w:cs="Arial"/>
                 <w:szCs w:val="24"/>
               </w:rPr>
-              <w:t xml:space="preserve">Front left tire </w:t>
-            </w:r>
-            <w:r>
-              <w:rPr>
-                <w:rFonts w:cs="Arial"/>
-                <w:szCs w:val="24"/>
-              </w:rPr>
-              <w:t>rolling resistance</w:t>
-            </w:r>
-            <w:r>
-              <w:rPr>
-                <w:rFonts w:cs="Arial"/>
-                <w:szCs w:val="24"/>
-              </w:rPr>
-              <w:t xml:space="preserve"> force [N]</w:t>
+              <w:t>Front left tire rolling resistance force [N]</w:t>
             </w:r>
           </w:p>
         </w:tc>
@@ -6685,14 +5997,7 @@
                         <w:rFonts w:ascii="Cambria Math" w:hAnsi="Cambria Math" w:cs="Arial"/>
                         <w:szCs w:val="24"/>
                       </w:rPr>
-                      <m:t>rr,f</m:t>
-                    </m:r>
-                    <m:r>
-                      <w:rPr>
-                        <w:rFonts w:ascii="Cambria Math" w:hAnsi="Cambria Math" w:cs="Arial"/>
-                        <w:szCs w:val="24"/>
-                      </w:rPr>
-                      <m:t>r</m:t>
+                      <m:t>rr,fr</m:t>
                     </m:r>
                   </m:sub>
                 </m:sSub>
@@ -6766,21 +6071,7 @@
                         <w:rFonts w:ascii="Cambria Math" w:hAnsi="Cambria Math" w:cs="Arial"/>
                         <w:szCs w:val="24"/>
                       </w:rPr>
-                      <m:t>rr,</m:t>
-                    </m:r>
-                    <m:r>
-                      <w:rPr>
-                        <w:rFonts w:ascii="Cambria Math" w:hAnsi="Cambria Math" w:cs="Arial"/>
-                        <w:szCs w:val="24"/>
-                      </w:rPr>
-                      <m:t>r</m:t>
-                    </m:r>
-                    <m:r>
-                      <w:rPr>
-                        <w:rFonts w:ascii="Cambria Math" w:hAnsi="Cambria Math" w:cs="Arial"/>
-                        <w:szCs w:val="24"/>
-                      </w:rPr>
-                      <m:t>l</m:t>
+                      <m:t>rr,rl</m:t>
                     </m:r>
                   </m:sub>
                 </m:sSub>
@@ -6854,14 +6145,7 @@
                         <w:rFonts w:ascii="Cambria Math" w:hAnsi="Cambria Math" w:cs="Arial"/>
                         <w:szCs w:val="24"/>
                       </w:rPr>
-                      <m:t>rr,</m:t>
-                    </m:r>
-                    <m:r>
-                      <w:rPr>
-                        <w:rFonts w:ascii="Cambria Math" w:hAnsi="Cambria Math" w:cs="Arial"/>
-                        <w:szCs w:val="24"/>
-                      </w:rPr>
-                      <m:t>rr</m:t>
+                      <m:t>rr,rr</m:t>
                     </m:r>
                   </m:sub>
                 </m:sSub>
@@ -6935,14 +6219,7 @@
                         <w:rFonts w:ascii="Cambria Math" w:eastAsiaTheme="minorEastAsia" w:hAnsi="Cambria Math" w:cs="Arial"/>
                         <w:szCs w:val="24"/>
                       </w:rPr>
-                      <m:t>f</m:t>
-                    </m:r>
-                    <m:r>
-                      <w:rPr>
-                        <w:rFonts w:ascii="Cambria Math" w:eastAsiaTheme="minorEastAsia" w:hAnsi="Cambria Math" w:cs="Arial"/>
-                        <w:szCs w:val="24"/>
-                      </w:rPr>
-                      <m:t>l</m:t>
+                      <m:t>fl</m:t>
                     </m:r>
                   </m:sub>
                 </m:sSub>
@@ -6969,35 +6246,7 @@
                 <w:rFonts w:cs="Arial"/>
                 <w:szCs w:val="24"/>
               </w:rPr>
-              <w:t xml:space="preserve">Front left tire </w:t>
-            </w:r>
-            <w:r>
-              <w:rPr>
-                <w:rFonts w:cs="Arial"/>
-                <w:szCs w:val="24"/>
-              </w:rPr>
-              <w:t>steering angle</w:t>
-            </w:r>
-            <w:r>
-              <w:rPr>
-                <w:rFonts w:cs="Arial"/>
-                <w:szCs w:val="24"/>
-              </w:rPr>
-              <w:t xml:space="preserve"> [</w:t>
-            </w:r>
-            <w:r>
-              <w:rPr>
-                <w:rFonts w:cs="Arial"/>
-                <w:szCs w:val="24"/>
-              </w:rPr>
-              <w:t>°</w:t>
-            </w:r>
-            <w:r>
-              <w:rPr>
-                <w:rFonts w:cs="Arial"/>
-                <w:szCs w:val="24"/>
-              </w:rPr>
-              <w:t>]</w:t>
+              <w:t>Front left tire steering angle [°]</w:t>
             </w:r>
           </w:p>
         </w:tc>
@@ -7118,14 +6367,7 @@
                         <w:rFonts w:ascii="Cambria Math" w:eastAsiaTheme="minorEastAsia" w:hAnsi="Cambria Math" w:cs="Arial"/>
                         <w:szCs w:val="24"/>
                       </w:rPr>
-                      <m:t>r</m:t>
-                    </m:r>
-                    <m:r>
-                      <w:rPr>
-                        <w:rFonts w:ascii="Cambria Math" w:eastAsiaTheme="minorEastAsia" w:hAnsi="Cambria Math" w:cs="Arial"/>
-                        <w:szCs w:val="24"/>
-                      </w:rPr>
-                      <m:t>l</m:t>
+                      <m:t>rl</m:t>
                     </m:r>
                   </m:sub>
                 </m:sSub>
@@ -7199,14 +6441,7 @@
                         <w:rFonts w:ascii="Cambria Math" w:eastAsiaTheme="minorEastAsia" w:hAnsi="Cambria Math" w:cs="Arial"/>
                         <w:szCs w:val="24"/>
                       </w:rPr>
-                      <m:t>r</m:t>
-                    </m:r>
-                    <m:r>
-                      <w:rPr>
-                        <w:rFonts w:ascii="Cambria Math" w:eastAsiaTheme="minorEastAsia" w:hAnsi="Cambria Math" w:cs="Arial"/>
-                        <w:szCs w:val="24"/>
-                      </w:rPr>
-                      <m:t>r</m:t>
+                      <m:t>rr</m:t>
                     </m:r>
                   </m:sub>
                 </m:sSub>
@@ -7280,14 +6515,7 @@
                         <w:rFonts w:ascii="Cambria Math" w:eastAsiaTheme="minorEastAsia" w:hAnsi="Cambria Math" w:cs="Arial"/>
                         <w:szCs w:val="24"/>
                       </w:rPr>
-                      <m:t>f</m:t>
-                    </m:r>
-                    <m:r>
-                      <w:rPr>
-                        <w:rFonts w:ascii="Cambria Math" w:eastAsiaTheme="minorEastAsia" w:hAnsi="Cambria Math" w:cs="Arial"/>
-                        <w:szCs w:val="24"/>
-                      </w:rPr>
-                      <m:t>l</m:t>
+                      <m:t>fl</m:t>
                     </m:r>
                   </m:sub>
                 </m:sSub>
@@ -7314,21 +6542,7 @@
                 <w:rFonts w:cs="Arial"/>
                 <w:szCs w:val="24"/>
               </w:rPr>
-              <w:t xml:space="preserve">Front </w:t>
-            </w:r>
-            <w:r>
-              <w:rPr>
-                <w:rFonts w:cs="Arial"/>
-                <w:szCs w:val="24"/>
-              </w:rPr>
-              <w:t>left</w:t>
-            </w:r>
-            <w:r>
-              <w:rPr>
-                <w:rFonts w:cs="Arial"/>
-                <w:szCs w:val="24"/>
-              </w:rPr>
-              <w:t xml:space="preserve"> tire radius [m]</w:t>
+              <w:t>Front left tire radius [m]</w:t>
             </w:r>
           </w:p>
         </w:tc>
@@ -7402,21 +6616,7 @@
                 <w:rFonts w:cs="Arial"/>
                 <w:szCs w:val="24"/>
               </w:rPr>
-              <w:t xml:space="preserve">Front </w:t>
-            </w:r>
-            <w:r>
-              <w:rPr>
-                <w:rFonts w:cs="Arial"/>
-                <w:szCs w:val="24"/>
-              </w:rPr>
-              <w:t>right</w:t>
-            </w:r>
-            <w:r>
-              <w:rPr>
-                <w:rFonts w:cs="Arial"/>
-                <w:szCs w:val="24"/>
-              </w:rPr>
-              <w:t xml:space="preserve"> tire radius [m]</w:t>
+              <w:t>Front right tire radius [m]</w:t>
             </w:r>
           </w:p>
         </w:tc>
@@ -7463,14 +6663,7 @@
                         <w:rFonts w:ascii="Cambria Math" w:eastAsiaTheme="minorEastAsia" w:hAnsi="Cambria Math" w:cs="Arial"/>
                         <w:szCs w:val="24"/>
                       </w:rPr>
-                      <m:t>r</m:t>
-                    </m:r>
-                    <m:r>
-                      <w:rPr>
-                        <w:rFonts w:ascii="Cambria Math" w:eastAsiaTheme="minorEastAsia" w:hAnsi="Cambria Math" w:cs="Arial"/>
-                        <w:szCs w:val="24"/>
-                      </w:rPr>
-                      <m:t>l</m:t>
+                      <m:t>rl</m:t>
                     </m:r>
                   </m:sub>
                 </m:sSub>
@@ -7497,21 +6690,7 @@
                 <w:rFonts w:cs="Arial"/>
                 <w:szCs w:val="24"/>
               </w:rPr>
-              <w:t>Rear</w:t>
-            </w:r>
-            <w:r>
-              <w:rPr>
-                <w:rFonts w:cs="Arial"/>
-                <w:szCs w:val="24"/>
-              </w:rPr>
-              <w:t xml:space="preserve"> left</w:t>
-            </w:r>
-            <w:r>
-              <w:rPr>
-                <w:rFonts w:cs="Arial"/>
-                <w:szCs w:val="24"/>
-              </w:rPr>
-              <w:t xml:space="preserve"> tire radius [m]</w:t>
+              <w:t>Rear left tire radius [m]</w:t>
             </w:r>
           </w:p>
         </w:tc>
@@ -7558,14 +6737,7 @@
                         <w:rFonts w:ascii="Cambria Math" w:eastAsiaTheme="minorEastAsia" w:hAnsi="Cambria Math" w:cs="Arial"/>
                         <w:szCs w:val="24"/>
                       </w:rPr>
-                      <m:t>r</m:t>
-                    </m:r>
-                    <m:r>
-                      <w:rPr>
-                        <w:rFonts w:ascii="Cambria Math" w:eastAsiaTheme="minorEastAsia" w:hAnsi="Cambria Math" w:cs="Arial"/>
-                        <w:szCs w:val="24"/>
-                      </w:rPr>
-                      <m:t>r</m:t>
+                      <m:t>rr</m:t>
                     </m:r>
                   </m:sub>
                 </m:sSub>
@@ -7592,21 +6764,7 @@
                 <w:rFonts w:cs="Arial"/>
                 <w:szCs w:val="24"/>
               </w:rPr>
-              <w:t xml:space="preserve">Rear </w:t>
-            </w:r>
-            <w:r>
-              <w:rPr>
-                <w:rFonts w:cs="Arial"/>
-                <w:szCs w:val="24"/>
-              </w:rPr>
-              <w:t>right</w:t>
-            </w:r>
-            <w:r>
-              <w:rPr>
-                <w:rFonts w:cs="Arial"/>
-                <w:szCs w:val="24"/>
-              </w:rPr>
-              <w:t xml:space="preserve"> tire radius [m]</w:t>
+              <w:t>Rear right tire radius [m]</w:t>
             </w:r>
           </w:p>
         </w:tc>
@@ -11272,21 +10430,7 @@
         <w:rPr>
           <w:rFonts w:eastAsiaTheme="minorEastAsia"/>
         </w:rPr>
-        <w:t xml:space="preserve"> </w:t>
-      </w:r>
-      <w:proofErr w:type="gramStart"/>
-      <w:r>
-        <w:rPr>
-          <w:rFonts w:eastAsiaTheme="minorEastAsia"/>
-        </w:rPr>
-        <w:t>is</w:t>
-      </w:r>
-      <w:proofErr w:type="gramEnd"/>
-      <w:r>
-        <w:rPr>
-          <w:rFonts w:eastAsiaTheme="minorEastAsia"/>
-        </w:rPr>
-        <w:t xml:space="preserve"> the frontal area of the vehicle</w:t>
+        <w:t xml:space="preserve"> is the frontal area of the vehicle</w:t>
       </w:r>
       <w:r>
         <w:rPr>
@@ -11557,13 +10701,7 @@
               <w:rPr>
                 <w:rFonts w:ascii="Cambria Math" w:eastAsiaTheme="minorEastAsia" w:hAnsi="Cambria Math"/>
               </w:rPr>
-              <m:t>down,</m:t>
-            </m:r>
-            <m:r>
-              <w:rPr>
-                <w:rFonts w:ascii="Cambria Math" w:eastAsiaTheme="minorEastAsia" w:hAnsi="Cambria Math"/>
-              </w:rPr>
-              <m:t>y</m:t>
+              <m:t>down,y</m:t>
             </m:r>
           </m:sub>
         </m:sSub>
@@ -13834,13 +12972,7 @@
                     <w:rPr>
                       <w:rFonts w:ascii="Cambria Math" w:hAnsi="Cambria Math"/>
                     </w:rPr>
-                    <m:t>f</m:t>
-                  </m:r>
-                  <m:r>
-                    <w:rPr>
-                      <w:rFonts w:ascii="Cambria Math" w:hAnsi="Cambria Math"/>
-                    </w:rPr>
-                    <m:t>l</m:t>
+                    <m:t>fl</m:t>
                   </m:r>
                 </m:sub>
               </m:sSub>
@@ -13872,13 +13004,7 @@
                     <w:rPr>
                       <w:rFonts w:ascii="Cambria Math" w:hAnsi="Cambria Math"/>
                     </w:rPr>
-                    <m:t>f</m:t>
-                  </m:r>
-                  <m:r>
-                    <w:rPr>
-                      <w:rFonts w:ascii="Cambria Math" w:hAnsi="Cambria Math"/>
-                    </w:rPr>
-                    <m:t>r</m:t>
+                    <m:t>fr</m:t>
                   </m:r>
                 </m:sub>
               </m:sSub>
@@ -14001,13 +13127,7 @@
                     <w:rPr>
                       <w:rFonts w:ascii="Cambria Math" w:hAnsi="Cambria Math"/>
                     </w:rPr>
-                    <m:t>r</m:t>
-                  </m:r>
-                  <m:r>
-                    <w:rPr>
-                      <w:rFonts w:ascii="Cambria Math" w:hAnsi="Cambria Math"/>
-                    </w:rPr>
-                    <m:t>l</m:t>
+                    <m:t>rl</m:t>
                   </m:r>
                 </m:sub>
               </m:sSub>
@@ -14039,13 +13159,7 @@
                     <w:rPr>
                       <w:rFonts w:ascii="Cambria Math" w:hAnsi="Cambria Math"/>
                     </w:rPr>
-                    <m:t>r</m:t>
-                  </m:r>
-                  <m:r>
-                    <w:rPr>
-                      <w:rFonts w:ascii="Cambria Math" w:hAnsi="Cambria Math"/>
-                    </w:rPr>
-                    <m:t>r</m:t>
+                    <m:t>rr</m:t>
                   </m:r>
                 </m:sub>
               </m:sSub>
@@ -16717,6 +15831,9 @@
       </w:r>
       <w:r>
         <w:t>, described in Equations 27</w:t>
+      </w:r>
+      <w:r>
+        <w:t xml:space="preserve"> and 28, respectively</w:t>
       </w:r>
       <w:r>
         <w:t>:</w:t>
@@ -17308,7 +16425,7 @@
                             <w:rPr>
                               <w:rFonts w:ascii="Cambria Math" w:hAnsi="Cambria Math"/>
                             </w:rPr>
-                            <m:t>f</m:t>
+                            <m:t>r</m:t>
                           </m:r>
                         </m:sub>
                       </m:sSub>
@@ -17344,6 +16461,13 @@
           </m:eqArr>
         </m:oMath>
       </m:oMathPara>
+    </w:p>
+    <w:p>
+      <w:pPr>
+        <w:rPr>
+          <w:rFonts w:eastAsiaTheme="minorEastAsia"/>
+        </w:rPr>
+      </w:pPr>
     </w:p>
     <w:p>
       <w:pPr>
@@ -17615,7 +16739,7 @@
                     <w:rPr>
                       <w:rFonts w:ascii="Cambria Math" w:eastAsiaTheme="minorEastAsia" w:hAnsi="Cambria Math"/>
                     </w:rPr>
-                    <m:t>r</m:t>
+                    <m:t>f</m:t>
                   </m:r>
                 </m:sub>
               </m:sSub>
@@ -17632,16 +16756,66 @@
       </w:pPr>
       <m:oMathPara>
         <m:oMath>
-          <m:sSubSup>
-            <m:sSubSupPr>
+          <m:eqArr>
+            <m:eqArrPr>
+              <m:maxDist m:val="1"/>
               <m:ctrlPr>
                 <w:rPr>
-                  <w:rFonts w:ascii="Cambria Math" w:hAnsi="Cambria Math"/>
+                  <w:rFonts w:ascii="Cambria Math" w:eastAsiaTheme="minorEastAsia" w:hAnsi="Cambria Math"/>
                   <w:i/>
                 </w:rPr>
               </m:ctrlPr>
-            </m:sSubSupPr>
+            </m:eqArrPr>
             <m:e>
+              <m:sSubSup>
+                <m:sSubSupPr>
+                  <m:ctrlPr>
+                    <w:rPr>
+                      <w:rFonts w:ascii="Cambria Math" w:hAnsi="Cambria Math"/>
+                      <w:i/>
+                    </w:rPr>
+                  </m:ctrlPr>
+                </m:sSubSupPr>
+                <m:e>
+                  <m:r>
+                    <m:rPr>
+                      <m:sty m:val="p"/>
+                    </m:rPr>
+                    <w:rPr>
+                      <w:rFonts w:ascii="Cambria Math" w:hAnsi="Cambria Math"/>
+                    </w:rPr>
+                    <m:t>Δ</m:t>
+                  </m:r>
+                  <m:r>
+                    <w:rPr>
+                      <w:rFonts w:ascii="Cambria Math" w:hAnsi="Cambria Math"/>
+                    </w:rPr>
+                    <m:t>T</m:t>
+                  </m:r>
+                </m:e>
+                <m:sub>
+                  <m:r>
+                    <w:rPr>
+                      <w:rFonts w:ascii="Cambria Math" w:hAnsi="Cambria Math"/>
+                    </w:rPr>
+                    <m:t>r</m:t>
+                  </m:r>
+                </m:sub>
+                <m:sup>
+                  <m:r>
+                    <w:rPr>
+                      <w:rFonts w:ascii="Cambria Math" w:hAnsi="Cambria Math"/>
+                    </w:rPr>
+                    <m:t>slip</m:t>
+                  </m:r>
+                </m:sup>
+              </m:sSubSup>
+              <m:r>
+                <w:rPr>
+                  <w:rFonts w:ascii="Cambria Math" w:hAnsi="Cambria Math"/>
+                </w:rPr>
+                <m:t>=</m:t>
+              </m:r>
               <m:r>
                 <m:rPr>
                   <m:sty m:val="p"/>
@@ -17649,108 +16823,197 @@
                 <w:rPr>
                   <w:rFonts w:ascii="Cambria Math" w:hAnsi="Cambria Math"/>
                 </w:rPr>
-                <m:t>Δ</m:t>
-              </m:r>
-              <m:r>
-                <w:rPr>
-                  <w:rFonts w:ascii="Cambria Math" w:hAnsi="Cambria Math"/>
-                </w:rPr>
-                <m:t>T</m:t>
-              </m:r>
-            </m:e>
-            <m:sub>
-              <m:r>
-                <w:rPr>
-                  <w:rFonts w:ascii="Cambria Math" w:hAnsi="Cambria Math"/>
-                </w:rPr>
-                <m:t>r</m:t>
-              </m:r>
-            </m:sub>
-            <m:sup>
-              <m:r>
-                <w:rPr>
-                  <w:rFonts w:ascii="Cambria Math" w:hAnsi="Cambria Math"/>
-                </w:rPr>
-                <m:t>slip</m:t>
-              </m:r>
-            </m:sup>
-          </m:sSubSup>
-          <m:r>
-            <w:rPr>
-              <w:rFonts w:ascii="Cambria Math" w:hAnsi="Cambria Math"/>
-            </w:rPr>
-            <m:t>=</m:t>
-          </m:r>
-          <m:r>
-            <m:rPr>
-              <m:sty m:val="p"/>
-            </m:rPr>
-            <w:rPr>
-              <w:rFonts w:ascii="Cambria Math" w:hAnsi="Cambria Math"/>
-            </w:rPr>
-            <m:t>max</m:t>
-          </m:r>
-          <m:d>
-            <m:dPr>
-              <m:ctrlPr>
-                <w:rPr>
-                  <w:rFonts w:ascii="Cambria Math" w:hAnsi="Cambria Math"/>
-                </w:rPr>
-              </m:ctrlPr>
-            </m:dPr>
-            <m:e>
-              <m:r>
-                <m:rPr>
-                  <m:sty m:val="p"/>
-                </m:rPr>
-                <w:rPr>
-                  <w:rFonts w:ascii="Cambria Math" w:hAnsi="Cambria Math"/>
-                </w:rPr>
-                <m:t>⁡</m:t>
+                <m:t>max</m:t>
               </m:r>
               <m:d>
                 <m:dPr>
-                  <m:begChr m:val="|"/>
-                  <m:endChr m:val="|"/>
                   <m:ctrlPr>
                     <w:rPr>
                       <w:rFonts w:ascii="Cambria Math" w:hAnsi="Cambria Math"/>
-                      <w:i/>
                     </w:rPr>
                   </m:ctrlPr>
                 </m:dPr>
                 <m:e>
-                  <m:sSub>
-                    <m:sSubPr>
+                  <m:r>
+                    <m:rPr>
+                      <m:sty m:val="p"/>
+                    </m:rPr>
+                    <w:rPr>
+                      <w:rFonts w:ascii="Cambria Math" w:hAnsi="Cambria Math"/>
+                    </w:rPr>
+                    <m:t>⁡</m:t>
+                  </m:r>
+                  <m:d>
+                    <m:dPr>
+                      <m:begChr m:val="|"/>
+                      <m:endChr m:val="|"/>
                       <m:ctrlPr>
                         <w:rPr>
                           <w:rFonts w:ascii="Cambria Math" w:hAnsi="Cambria Math"/>
                           <w:i/>
                         </w:rPr>
                       </m:ctrlPr>
-                    </m:sSubPr>
+                    </m:dPr>
                     <m:e>
+                      <m:sSub>
+                        <m:sSubPr>
+                          <m:ctrlPr>
+                            <w:rPr>
+                              <w:rFonts w:ascii="Cambria Math" w:hAnsi="Cambria Math"/>
+                              <w:i/>
+                            </w:rPr>
+                          </m:ctrlPr>
+                        </m:sSubPr>
+                        <m:e>
+                          <m:r>
+                            <w:rPr>
+                              <w:rFonts w:ascii="Cambria Math" w:hAnsi="Cambria Math"/>
+                            </w:rPr>
+                            <m:t>T</m:t>
+                          </m:r>
+                        </m:e>
+                        <m:sub>
+                          <m:r>
+                            <w:rPr>
+                              <w:rFonts w:ascii="Cambria Math" w:hAnsi="Cambria Math"/>
+                            </w:rPr>
+                            <m:t>rl</m:t>
+                          </m:r>
+                        </m:sub>
+                      </m:sSub>
                       <m:r>
                         <w:rPr>
                           <w:rFonts w:ascii="Cambria Math" w:hAnsi="Cambria Math"/>
                         </w:rPr>
-                        <m:t>T</m:t>
+                        <m:t>+</m:t>
                       </m:r>
+                      <m:sSub>
+                        <m:sSubPr>
+                          <m:ctrlPr>
+                            <w:rPr>
+                              <w:rFonts w:ascii="Cambria Math" w:hAnsi="Cambria Math"/>
+                              <w:i/>
+                            </w:rPr>
+                          </m:ctrlPr>
+                        </m:sSubPr>
+                        <m:e>
+                          <m:r>
+                            <w:rPr>
+                              <w:rFonts w:ascii="Cambria Math" w:hAnsi="Cambria Math"/>
+                            </w:rPr>
+                            <m:t>T</m:t>
+                          </m:r>
+                        </m:e>
+                        <m:sub>
+                          <m:r>
+                            <w:rPr>
+                              <w:rFonts w:ascii="Cambria Math" w:hAnsi="Cambria Math"/>
+                            </w:rPr>
+                            <m:t>rr</m:t>
+                          </m:r>
+                        </m:sub>
+                      </m:sSub>
                     </m:e>
-                    <m:sub>
+                  </m:d>
+                  <m:f>
+                    <m:fPr>
+                      <m:ctrlPr>
+                        <w:rPr>
+                          <w:rFonts w:ascii="Cambria Math" w:hAnsi="Cambria Math"/>
+                          <w:i/>
+                        </w:rPr>
+                      </m:ctrlPr>
+                    </m:fPr>
+                    <m:num>
+                      <m:sSubSup>
+                        <m:sSubSupPr>
+                          <m:ctrlPr>
+                            <w:rPr>
+                              <w:rFonts w:ascii="Cambria Math" w:eastAsiaTheme="minorEastAsia" w:hAnsi="Cambria Math"/>
+                              <w:i/>
+                            </w:rPr>
+                          </m:ctrlPr>
+                        </m:sSubSupPr>
+                        <m:e>
+                          <m:r>
+                            <w:rPr>
+                              <w:rFonts w:ascii="Cambria Math" w:eastAsiaTheme="minorEastAsia" w:hAnsi="Cambria Math"/>
+                            </w:rPr>
+                            <m:t>TBR</m:t>
+                          </m:r>
+                        </m:e>
+                        <m:sub>
+                          <m:r>
+                            <w:rPr>
+                              <w:rFonts w:ascii="Cambria Math" w:eastAsiaTheme="minorEastAsia" w:hAnsi="Cambria Math"/>
+                            </w:rPr>
+                            <m:t>r</m:t>
+                          </m:r>
+                        </m:sub>
+                        <m:sup>
+                          <m:r>
+                            <w:rPr>
+                              <w:rFonts w:ascii="Cambria Math" w:eastAsiaTheme="minorEastAsia" w:hAnsi="Cambria Math"/>
+                            </w:rPr>
+                            <m:t>brake</m:t>
+                          </m:r>
+                        </m:sup>
+                      </m:sSubSup>
                       <m:r>
                         <w:rPr>
-                          <w:rFonts w:ascii="Cambria Math" w:hAnsi="Cambria Math"/>
+                          <w:rFonts w:ascii="Cambria Math" w:eastAsiaTheme="minorEastAsia" w:hAnsi="Cambria Math"/>
                         </w:rPr>
-                        <m:t>rl</m:t>
+                        <m:t>-1</m:t>
                       </m:r>
-                    </m:sub>
-                  </m:sSub>
+                    </m:num>
+                    <m:den>
+                      <m:sSubSup>
+                        <m:sSubSupPr>
+                          <m:ctrlPr>
+                            <w:rPr>
+                              <w:rFonts w:ascii="Cambria Math" w:eastAsiaTheme="minorEastAsia" w:hAnsi="Cambria Math"/>
+                              <w:i/>
+                            </w:rPr>
+                          </m:ctrlPr>
+                        </m:sSubSupPr>
+                        <m:e>
+                          <m:r>
+                            <w:rPr>
+                              <w:rFonts w:ascii="Cambria Math" w:eastAsiaTheme="minorEastAsia" w:hAnsi="Cambria Math"/>
+                            </w:rPr>
+                            <m:t>TBR</m:t>
+                          </m:r>
+                        </m:e>
+                        <m:sub>
+                          <m:r>
+                            <w:rPr>
+                              <w:rFonts w:ascii="Cambria Math" w:eastAsiaTheme="minorEastAsia" w:hAnsi="Cambria Math"/>
+                            </w:rPr>
+                            <m:t>r</m:t>
+                          </m:r>
+                        </m:sub>
+                        <m:sup>
+                          <m:r>
+                            <w:rPr>
+                              <w:rFonts w:ascii="Cambria Math" w:eastAsiaTheme="minorEastAsia" w:hAnsi="Cambria Math"/>
+                            </w:rPr>
+                            <m:t>brake</m:t>
+                          </m:r>
+                        </m:sup>
+                      </m:sSubSup>
+                      <m:r>
+                        <w:rPr>
+                          <w:rFonts w:ascii="Cambria Math" w:eastAsiaTheme="minorEastAsia" w:hAnsi="Cambria Math"/>
+                        </w:rPr>
+                        <m:t>+1</m:t>
+                      </m:r>
+                    </m:den>
+                  </m:f>
                   <m:r>
                     <w:rPr>
                       <w:rFonts w:ascii="Cambria Math" w:hAnsi="Cambria Math"/>
                     </w:rPr>
-                    <m:t>+</m:t>
+                    <m:t>,</m:t>
                   </m:r>
                   <m:sSub>
                     <m:sSubPr>
@@ -17766,7 +17029,7 @@
                         <w:rPr>
                           <w:rFonts w:ascii="Cambria Math" w:hAnsi="Cambria Math"/>
                         </w:rPr>
-                        <m:t>T</m:t>
+                        <m:t xml:space="preserve"> preload</m:t>
                       </m:r>
                     </m:e>
                     <m:sub>
@@ -17774,140 +17037,44 @@
                         <w:rPr>
                           <w:rFonts w:ascii="Cambria Math" w:hAnsi="Cambria Math"/>
                         </w:rPr>
-                        <m:t>rr</m:t>
+                        <m:t>r</m:t>
                       </m:r>
                     </m:sub>
                   </m:sSub>
                 </m:e>
               </m:d>
-              <m:f>
-                <m:fPr>
-                  <m:ctrlPr>
-                    <w:rPr>
-                      <w:rFonts w:ascii="Cambria Math" w:hAnsi="Cambria Math"/>
-                      <w:i/>
-                    </w:rPr>
-                  </m:ctrlPr>
-                </m:fPr>
-                <m:num>
-                  <m:sSubSup>
-                    <m:sSubSupPr>
-                      <m:ctrlPr>
-                        <w:rPr>
-                          <w:rFonts w:ascii="Cambria Math" w:eastAsiaTheme="minorEastAsia" w:hAnsi="Cambria Math"/>
-                          <w:i/>
-                        </w:rPr>
-                      </m:ctrlPr>
-                    </m:sSubSupPr>
-                    <m:e>
-                      <m:r>
-                        <w:rPr>
-                          <w:rFonts w:ascii="Cambria Math" w:eastAsiaTheme="minorEastAsia" w:hAnsi="Cambria Math"/>
-                        </w:rPr>
-                        <m:t>TBR</m:t>
-                      </m:r>
-                    </m:e>
-                    <m:sub>
-                      <m:r>
-                        <w:rPr>
-                          <w:rFonts w:ascii="Cambria Math" w:eastAsiaTheme="minorEastAsia" w:hAnsi="Cambria Math"/>
-                        </w:rPr>
-                        <m:t>r</m:t>
-                      </m:r>
-                    </m:sub>
-                    <m:sup>
-                      <m:r>
-                        <w:rPr>
-                          <w:rFonts w:ascii="Cambria Math" w:eastAsiaTheme="minorEastAsia" w:hAnsi="Cambria Math"/>
-                        </w:rPr>
-                        <m:t>brake</m:t>
-                      </m:r>
-                    </m:sup>
-                  </m:sSubSup>
-                  <m:r>
-                    <w:rPr>
-                      <w:rFonts w:ascii="Cambria Math" w:eastAsiaTheme="minorEastAsia" w:hAnsi="Cambria Math"/>
-                    </w:rPr>
-                    <m:t>-1</m:t>
-                  </m:r>
-                </m:num>
-                <m:den>
-                  <m:sSubSup>
-                    <m:sSubSupPr>
-                      <m:ctrlPr>
-                        <w:rPr>
-                          <w:rFonts w:ascii="Cambria Math" w:eastAsiaTheme="minorEastAsia" w:hAnsi="Cambria Math"/>
-                          <w:i/>
-                        </w:rPr>
-                      </m:ctrlPr>
-                    </m:sSubSupPr>
-                    <m:e>
-                      <m:r>
-                        <w:rPr>
-                          <w:rFonts w:ascii="Cambria Math" w:eastAsiaTheme="minorEastAsia" w:hAnsi="Cambria Math"/>
-                        </w:rPr>
-                        <m:t>TBR</m:t>
-                      </m:r>
-                    </m:e>
-                    <m:sub>
-                      <m:r>
-                        <w:rPr>
-                          <w:rFonts w:ascii="Cambria Math" w:eastAsiaTheme="minorEastAsia" w:hAnsi="Cambria Math"/>
-                        </w:rPr>
-                        <m:t>r</m:t>
-                      </m:r>
-                    </m:sub>
-                    <m:sup>
-                      <m:r>
-                        <w:rPr>
-                          <w:rFonts w:ascii="Cambria Math" w:eastAsiaTheme="minorEastAsia" w:hAnsi="Cambria Math"/>
-                        </w:rPr>
-                        <m:t>brake</m:t>
-                      </m:r>
-                    </m:sup>
-                  </m:sSubSup>
-                  <m:r>
-                    <w:rPr>
-                      <w:rFonts w:ascii="Cambria Math" w:eastAsiaTheme="minorEastAsia" w:hAnsi="Cambria Math"/>
-                    </w:rPr>
-                    <m:t>+1</m:t>
-                  </m:r>
-                </m:den>
-              </m:f>
               <m:r>
                 <w:rPr>
                   <w:rFonts w:ascii="Cambria Math" w:hAnsi="Cambria Math"/>
                 </w:rPr>
-                <m:t>,</m:t>
+                <m:t>#</m:t>
               </m:r>
-              <m:sSub>
-                <m:sSubPr>
+              <m:d>
+                <m:dPr>
                   <m:ctrlPr>
                     <w:rPr>
-                      <w:rFonts w:ascii="Cambria Math" w:hAnsi="Cambria Math"/>
+                      <w:rFonts w:ascii="Cambria Math" w:eastAsiaTheme="minorEastAsia" w:hAnsi="Cambria Math"/>
                       <w:i/>
                     </w:rPr>
                   </m:ctrlPr>
-                </m:sSubPr>
+                </m:dPr>
                 <m:e>
                   <m:r>
                     <w:rPr>
-                      <w:rFonts w:ascii="Cambria Math" w:hAnsi="Cambria Math"/>
-                    </w:rPr>
-                    <m:t xml:space="preserve"> preload</m:t>
+                      <w:rFonts w:ascii="Cambria Math" w:eastAsiaTheme="minorEastAsia" w:hAnsi="Cambria Math"/>
+                    </w:rPr>
+                    <m:t>28</m:t>
                   </m:r>
                 </m:e>
-                <m:sub>
-                  <m:r>
-                    <w:rPr>
-                      <w:rFonts w:ascii="Cambria Math" w:hAnsi="Cambria Math"/>
-                    </w:rPr>
-                    <m:t>r</m:t>
-                  </m:r>
-                </m:sub>
-              </m:sSub>
+              </m:d>
+              <m:ctrlPr>
+                <w:rPr>
+                  <w:rFonts w:ascii="Cambria Math" w:hAnsi="Cambria Math"/>
+                  <w:i/>
+                </w:rPr>
+              </m:ctrlPr>
             </m:e>
-          </m:d>
+          </m:eqArr>
         </m:oMath>
       </m:oMathPara>
     </w:p>
@@ -18057,7 +17224,7 @@
               <w:rPr>
                 <w:rFonts w:ascii="Cambria Math" w:hAnsi="Cambria Math"/>
               </w:rPr>
-              <m:t>lock</m:t>
+              <m:t>drive</m:t>
             </m:r>
           </m:sup>
         </m:sSubSup>
@@ -18099,7 +17266,7 @@
               <w:rPr>
                 <w:rFonts w:ascii="Cambria Math" w:hAnsi="Cambria Math"/>
               </w:rPr>
-              <m:t>lock</m:t>
+              <m:t>brake</m:t>
             </m:r>
           </m:sup>
         </m:sSubSup>
@@ -18108,13 +17275,31 @@
         <w:rPr>
           <w:rFonts w:eastAsiaTheme="minorEastAsia"/>
         </w:rPr>
-        <w:t xml:space="preserve"> for each axle. The torque difference is simply calculated as a linear equation, as shown below for driving and braking conditions</w:t>
+        <w:t xml:space="preserve"> for each axle</w:t>
       </w:r>
       <w:r>
         <w:rPr>
           <w:rFonts w:eastAsiaTheme="minorEastAsia"/>
         </w:rPr>
-        <w:t>, shown in Equations 28</w:t>
+        <w:t>, instead of TBR</w:t>
+      </w:r>
+      <w:r>
+        <w:rPr>
+          <w:rFonts w:eastAsiaTheme="minorEastAsia"/>
+        </w:rPr>
+        <w:t>. The torque difference is simply calculated as a linear equation, as shown below for driving and braking conditions</w:t>
+      </w:r>
+      <w:r>
+        <w:rPr>
+          <w:rFonts w:eastAsiaTheme="minorEastAsia"/>
+        </w:rPr>
+        <w:t>, shown in Equations 2</w:t>
+      </w:r>
+      <w:r>
+        <w:rPr>
+          <w:rFonts w:eastAsiaTheme="minorEastAsia"/>
+        </w:rPr>
+        <w:t>9 and 30, respectively</w:t>
       </w:r>
       <w:r>
         <w:rPr>
@@ -18211,7 +17396,7 @@
                 <w:rPr>
                   <w:rFonts w:ascii="Cambria Math" w:hAnsi="Cambria Math"/>
                 </w:rPr>
-                <m:t>lock</m:t>
+                <m:t>drive</m:t>
               </m:r>
             </m:sup>
           </m:sSubSup>
@@ -18287,100 +17472,6 @@
               </m:sSub>
             </m:e>
           </m:d>
-          <m:f>
-            <m:fPr>
-              <m:ctrlPr>
-                <w:rPr>
-                  <w:rFonts w:ascii="Cambria Math" w:hAnsi="Cambria Math"/>
-                  <w:i/>
-                </w:rPr>
-              </m:ctrlPr>
-            </m:fPr>
-            <m:num>
-              <m:sSubSup>
-                <m:sSubSupPr>
-                  <m:ctrlPr>
-                    <w:rPr>
-                      <w:rFonts w:ascii="Cambria Math" w:eastAsiaTheme="minorEastAsia" w:hAnsi="Cambria Math"/>
-                      <w:i/>
-                    </w:rPr>
-                  </m:ctrlPr>
-                </m:sSubSupPr>
-                <m:e>
-                  <m:r>
-                    <w:rPr>
-                      <w:rFonts w:ascii="Cambria Math" w:eastAsiaTheme="minorEastAsia" w:hAnsi="Cambria Math"/>
-                    </w:rPr>
-                    <m:t>TBR</m:t>
-                  </m:r>
-                </m:e>
-                <m:sub>
-                  <m:r>
-                    <w:rPr>
-                      <w:rFonts w:ascii="Cambria Math" w:eastAsiaTheme="minorEastAsia" w:hAnsi="Cambria Math"/>
-                    </w:rPr>
-                    <m:t>f</m:t>
-                  </m:r>
-                </m:sub>
-                <m:sup>
-                  <m:r>
-                    <w:rPr>
-                      <w:rFonts w:ascii="Cambria Math" w:eastAsiaTheme="minorEastAsia" w:hAnsi="Cambria Math"/>
-                    </w:rPr>
-                    <m:t>drive</m:t>
-                  </m:r>
-                </m:sup>
-              </m:sSubSup>
-              <m:r>
-                <w:rPr>
-                  <w:rFonts w:ascii="Cambria Math" w:eastAsiaTheme="minorEastAsia" w:hAnsi="Cambria Math"/>
-                </w:rPr>
-                <m:t>-1</m:t>
-              </m:r>
-            </m:num>
-            <m:den>
-              <m:sSubSup>
-                <m:sSubSupPr>
-                  <m:ctrlPr>
-                    <w:rPr>
-                      <w:rFonts w:ascii="Cambria Math" w:eastAsiaTheme="minorEastAsia" w:hAnsi="Cambria Math"/>
-                      <w:i/>
-                    </w:rPr>
-                  </m:ctrlPr>
-                </m:sSubSupPr>
-                <m:e>
-                  <m:r>
-                    <w:rPr>
-                      <w:rFonts w:ascii="Cambria Math" w:eastAsiaTheme="minorEastAsia" w:hAnsi="Cambria Math"/>
-                    </w:rPr>
-                    <m:t>TBR</m:t>
-                  </m:r>
-                </m:e>
-                <m:sub>
-                  <m:r>
-                    <w:rPr>
-                      <w:rFonts w:ascii="Cambria Math" w:eastAsiaTheme="minorEastAsia" w:hAnsi="Cambria Math"/>
-                    </w:rPr>
-                    <m:t>f</m:t>
-                  </m:r>
-                </m:sub>
-                <m:sup>
-                  <m:r>
-                    <w:rPr>
-                      <w:rFonts w:ascii="Cambria Math" w:eastAsiaTheme="minorEastAsia" w:hAnsi="Cambria Math"/>
-                    </w:rPr>
-                    <m:t>drive</m:t>
-                  </m:r>
-                </m:sup>
-              </m:sSubSup>
-              <m:r>
-                <w:rPr>
-                  <w:rFonts w:ascii="Cambria Math" w:eastAsiaTheme="minorEastAsia" w:hAnsi="Cambria Math"/>
-                </w:rPr>
-                <m:t>+1</m:t>
-              </m:r>
-            </m:den>
-          </m:f>
           <m:r>
             <w:rPr>
               <w:rFonts w:ascii="Cambria Math" w:hAnsi="Cambria Math"/>
@@ -18514,7 +17605,7 @@
                     <w:rPr>
                       <w:rFonts w:ascii="Cambria Math" w:hAnsi="Cambria Math"/>
                     </w:rPr>
-                    <m:t>lock</m:t>
+                    <m:t>drive</m:t>
                   </m:r>
                 </m:sup>
               </m:sSubSup>
@@ -18590,100 +17681,6 @@
                   </m:sSub>
                 </m:e>
               </m:d>
-              <m:f>
-                <m:fPr>
-                  <m:ctrlPr>
-                    <w:rPr>
-                      <w:rFonts w:ascii="Cambria Math" w:hAnsi="Cambria Math"/>
-                      <w:i/>
-                    </w:rPr>
-                  </m:ctrlPr>
-                </m:fPr>
-                <m:num>
-                  <m:sSubSup>
-                    <m:sSubSupPr>
-                      <m:ctrlPr>
-                        <w:rPr>
-                          <w:rFonts w:ascii="Cambria Math" w:eastAsiaTheme="minorEastAsia" w:hAnsi="Cambria Math"/>
-                          <w:i/>
-                        </w:rPr>
-                      </m:ctrlPr>
-                    </m:sSubSupPr>
-                    <m:e>
-                      <m:r>
-                        <w:rPr>
-                          <w:rFonts w:ascii="Cambria Math" w:eastAsiaTheme="minorEastAsia" w:hAnsi="Cambria Math"/>
-                        </w:rPr>
-                        <m:t>TBR</m:t>
-                      </m:r>
-                    </m:e>
-                    <m:sub>
-                      <m:r>
-                        <w:rPr>
-                          <w:rFonts w:ascii="Cambria Math" w:eastAsiaTheme="minorEastAsia" w:hAnsi="Cambria Math"/>
-                        </w:rPr>
-                        <m:t>r</m:t>
-                      </m:r>
-                    </m:sub>
-                    <m:sup>
-                      <m:r>
-                        <w:rPr>
-                          <w:rFonts w:ascii="Cambria Math" w:eastAsiaTheme="minorEastAsia" w:hAnsi="Cambria Math"/>
-                        </w:rPr>
-                        <m:t>drive</m:t>
-                      </m:r>
-                    </m:sup>
-                  </m:sSubSup>
-                  <m:r>
-                    <w:rPr>
-                      <w:rFonts w:ascii="Cambria Math" w:eastAsiaTheme="minorEastAsia" w:hAnsi="Cambria Math"/>
-                    </w:rPr>
-                    <m:t>-1</m:t>
-                  </m:r>
-                </m:num>
-                <m:den>
-                  <m:sSubSup>
-                    <m:sSubSupPr>
-                      <m:ctrlPr>
-                        <w:rPr>
-                          <w:rFonts w:ascii="Cambria Math" w:eastAsiaTheme="minorEastAsia" w:hAnsi="Cambria Math"/>
-                          <w:i/>
-                        </w:rPr>
-                      </m:ctrlPr>
-                    </m:sSubSupPr>
-                    <m:e>
-                      <m:r>
-                        <w:rPr>
-                          <w:rFonts w:ascii="Cambria Math" w:eastAsiaTheme="minorEastAsia" w:hAnsi="Cambria Math"/>
-                        </w:rPr>
-                        <m:t>TBR</m:t>
-                      </m:r>
-                    </m:e>
-                    <m:sub>
-                      <m:r>
-                        <w:rPr>
-                          <w:rFonts w:ascii="Cambria Math" w:eastAsiaTheme="minorEastAsia" w:hAnsi="Cambria Math"/>
-                        </w:rPr>
-                        <m:t>r</m:t>
-                      </m:r>
-                    </m:sub>
-                    <m:sup>
-                      <m:r>
-                        <w:rPr>
-                          <w:rFonts w:ascii="Cambria Math" w:eastAsiaTheme="minorEastAsia" w:hAnsi="Cambria Math"/>
-                        </w:rPr>
-                        <m:t>drive</m:t>
-                      </m:r>
-                    </m:sup>
-                  </m:sSubSup>
-                  <m:r>
-                    <w:rPr>
-                      <w:rFonts w:ascii="Cambria Math" w:eastAsiaTheme="minorEastAsia" w:hAnsi="Cambria Math"/>
-                    </w:rPr>
-                    <m:t>+1</m:t>
-                  </m:r>
-                </m:den>
-              </m:f>
               <m:r>
                 <w:rPr>
                   <w:rFonts w:ascii="Cambria Math" w:hAnsi="Cambria Math"/>
@@ -18712,7 +17709,7 @@
                     <w:rPr>
                       <w:rFonts w:ascii="Cambria Math" w:hAnsi="Cambria Math"/>
                     </w:rPr>
-                    <m:t>f</m:t>
+                    <m:t>r</m:t>
                   </m:r>
                 </m:sub>
               </m:sSub>
@@ -18736,7 +17733,13 @@
                     <w:rPr>
                       <w:rFonts w:ascii="Cambria Math" w:hAnsi="Cambria Math"/>
                     </w:rPr>
-                    <m:t>28</m:t>
+                    <m:t>2</m:t>
+                  </m:r>
+                  <m:r>
+                    <w:rPr>
+                      <w:rFonts w:ascii="Cambria Math" w:hAnsi="Cambria Math"/>
+                    </w:rPr>
+                    <m:t>9</m:t>
                   </m:r>
                 </m:e>
               </m:d>
@@ -18744,6 +17747,13 @@
           </m:eqArr>
         </m:oMath>
       </m:oMathPara>
+    </w:p>
+    <w:p>
+      <w:pPr>
+        <w:rPr>
+          <w:rFonts w:eastAsiaTheme="minorEastAsia"/>
+        </w:rPr>
+      </w:pPr>
     </w:p>
     <w:p>
       <w:pPr>
@@ -18832,7 +17842,7 @@
                 <w:rPr>
                   <w:rFonts w:ascii="Cambria Math" w:hAnsi="Cambria Math"/>
                 </w:rPr>
-                <m:t>lock</m:t>
+                <m:t>brake</m:t>
               </m:r>
             </m:sup>
           </m:sSubSup>
@@ -18908,100 +17918,6 @@
               </m:sSub>
             </m:e>
           </m:d>
-          <m:f>
-            <m:fPr>
-              <m:ctrlPr>
-                <w:rPr>
-                  <w:rFonts w:ascii="Cambria Math" w:hAnsi="Cambria Math"/>
-                  <w:i/>
-                </w:rPr>
-              </m:ctrlPr>
-            </m:fPr>
-            <m:num>
-              <m:sSubSup>
-                <m:sSubSupPr>
-                  <m:ctrlPr>
-                    <w:rPr>
-                      <w:rFonts w:ascii="Cambria Math" w:eastAsiaTheme="minorEastAsia" w:hAnsi="Cambria Math"/>
-                      <w:i/>
-                    </w:rPr>
-                  </m:ctrlPr>
-                </m:sSubSupPr>
-                <m:e>
-                  <m:r>
-                    <w:rPr>
-                      <w:rFonts w:ascii="Cambria Math" w:eastAsiaTheme="minorEastAsia" w:hAnsi="Cambria Math"/>
-                    </w:rPr>
-                    <m:t>TBR</m:t>
-                  </m:r>
-                </m:e>
-                <m:sub>
-                  <m:r>
-                    <w:rPr>
-                      <w:rFonts w:ascii="Cambria Math" w:eastAsiaTheme="minorEastAsia" w:hAnsi="Cambria Math"/>
-                    </w:rPr>
-                    <m:t>f</m:t>
-                  </m:r>
-                </m:sub>
-                <m:sup>
-                  <m:r>
-                    <w:rPr>
-                      <w:rFonts w:ascii="Cambria Math" w:eastAsiaTheme="minorEastAsia" w:hAnsi="Cambria Math"/>
-                    </w:rPr>
-                    <m:t>brake</m:t>
-                  </m:r>
-                </m:sup>
-              </m:sSubSup>
-              <m:r>
-                <w:rPr>
-                  <w:rFonts w:ascii="Cambria Math" w:eastAsiaTheme="minorEastAsia" w:hAnsi="Cambria Math"/>
-                </w:rPr>
-                <m:t>-1</m:t>
-              </m:r>
-            </m:num>
-            <m:den>
-              <m:sSubSup>
-                <m:sSubSupPr>
-                  <m:ctrlPr>
-                    <w:rPr>
-                      <w:rFonts w:ascii="Cambria Math" w:eastAsiaTheme="minorEastAsia" w:hAnsi="Cambria Math"/>
-                      <w:i/>
-                    </w:rPr>
-                  </m:ctrlPr>
-                </m:sSubSupPr>
-                <m:e>
-                  <m:r>
-                    <w:rPr>
-                      <w:rFonts w:ascii="Cambria Math" w:eastAsiaTheme="minorEastAsia" w:hAnsi="Cambria Math"/>
-                    </w:rPr>
-                    <m:t>TBR</m:t>
-                  </m:r>
-                </m:e>
-                <m:sub>
-                  <m:r>
-                    <w:rPr>
-                      <w:rFonts w:ascii="Cambria Math" w:eastAsiaTheme="minorEastAsia" w:hAnsi="Cambria Math"/>
-                    </w:rPr>
-                    <m:t>f</m:t>
-                  </m:r>
-                </m:sub>
-                <m:sup>
-                  <m:r>
-                    <w:rPr>
-                      <w:rFonts w:ascii="Cambria Math" w:eastAsiaTheme="minorEastAsia" w:hAnsi="Cambria Math"/>
-                    </w:rPr>
-                    <m:t>brake</m:t>
-                  </m:r>
-                </m:sup>
-              </m:sSubSup>
-              <m:r>
-                <w:rPr>
-                  <w:rFonts w:ascii="Cambria Math" w:eastAsiaTheme="minorEastAsia" w:hAnsi="Cambria Math"/>
-                </w:rPr>
-                <m:t>+1</m:t>
-              </m:r>
-            </m:den>
-          </m:f>
           <m:r>
             <w:rPr>
               <w:rFonts w:ascii="Cambria Math" w:hAnsi="Cambria Math"/>
@@ -19030,7 +17946,7 @@
                 <w:rPr>
                   <w:rFonts w:ascii="Cambria Math" w:hAnsi="Cambria Math"/>
                 </w:rPr>
-                <m:t>r</m:t>
+                <m:t>f</m:t>
               </m:r>
             </m:sub>
           </m:sSub>
@@ -19045,111 +17961,36 @@
       </w:pPr>
       <m:oMathPara>
         <m:oMath>
-          <m:sSubSup>
-            <m:sSubSupPr>
+          <m:eqArr>
+            <m:eqArrPr>
+              <m:maxDist m:val="1"/>
               <m:ctrlPr>
                 <w:rPr>
-                  <w:rFonts w:ascii="Cambria Math" w:hAnsi="Cambria Math"/>
+                  <w:rFonts w:ascii="Cambria Math" w:eastAsiaTheme="minorEastAsia" w:hAnsi="Cambria Math"/>
                   <w:i/>
                 </w:rPr>
               </m:ctrlPr>
-            </m:sSubSupPr>
+            </m:eqArrPr>
             <m:e>
-              <m:r>
-                <m:rPr>
-                  <m:sty m:val="p"/>
-                </m:rPr>
-                <w:rPr>
-                  <w:rFonts w:ascii="Cambria Math" w:hAnsi="Cambria Math"/>
-                </w:rPr>
-                <m:t>Δ</m:t>
-              </m:r>
-              <m:r>
-                <w:rPr>
-                  <w:rFonts w:ascii="Cambria Math" w:hAnsi="Cambria Math"/>
-                </w:rPr>
-                <m:t>T</m:t>
-              </m:r>
-            </m:e>
-            <m:sub>
-              <m:r>
-                <w:rPr>
-                  <w:rFonts w:ascii="Cambria Math" w:hAnsi="Cambria Math"/>
-                </w:rPr>
-                <m:t>r</m:t>
-              </m:r>
-            </m:sub>
-            <m:sup>
-              <m:r>
-                <w:rPr>
-                  <w:rFonts w:ascii="Cambria Math" w:hAnsi="Cambria Math"/>
-                </w:rPr>
-                <m:t>slip</m:t>
-              </m:r>
-            </m:sup>
-          </m:sSubSup>
-          <m:r>
-            <w:rPr>
-              <w:rFonts w:ascii="Cambria Math" w:hAnsi="Cambria Math"/>
-            </w:rPr>
-            <m:t>=</m:t>
-          </m:r>
-          <m:sSubSup>
-            <m:sSubSupPr>
-              <m:ctrlPr>
-                <w:rPr>
-                  <w:rFonts w:ascii="Cambria Math" w:hAnsi="Cambria Math"/>
-                  <w:i/>
-                </w:rPr>
-              </m:ctrlPr>
-            </m:sSubSupPr>
-            <m:e>
-              <m:r>
-                <w:rPr>
-                  <w:rFonts w:ascii="Cambria Math" w:hAnsi="Cambria Math"/>
-                </w:rPr>
-                <m:t>k</m:t>
-              </m:r>
-            </m:e>
-            <m:sub>
-              <m:r>
-                <w:rPr>
-                  <w:rFonts w:ascii="Cambria Math" w:hAnsi="Cambria Math"/>
-                </w:rPr>
-                <m:t>r</m:t>
-              </m:r>
-            </m:sub>
-            <m:sup>
-              <m:r>
-                <w:rPr>
-                  <w:rFonts w:ascii="Cambria Math" w:hAnsi="Cambria Math"/>
-                </w:rPr>
-                <m:t>lock</m:t>
-              </m:r>
-            </m:sup>
-          </m:sSubSup>
-          <m:d>
-            <m:dPr>
-              <m:begChr m:val="|"/>
-              <m:endChr m:val="|"/>
-              <m:ctrlPr>
-                <w:rPr>
-                  <w:rFonts w:ascii="Cambria Math" w:hAnsi="Cambria Math"/>
-                  <w:i/>
-                </w:rPr>
-              </m:ctrlPr>
-            </m:dPr>
-            <m:e>
-              <m:sSub>
-                <m:sSubPr>
+              <m:sSubSup>
+                <m:sSubSupPr>
                   <m:ctrlPr>
                     <w:rPr>
                       <w:rFonts w:ascii="Cambria Math" w:hAnsi="Cambria Math"/>
                       <w:i/>
                     </w:rPr>
                   </m:ctrlPr>
-                </m:sSubPr>
+                </m:sSubSupPr>
                 <m:e>
+                  <m:r>
+                    <m:rPr>
+                      <m:sty m:val="p"/>
+                    </m:rPr>
+                    <w:rPr>
+                      <w:rFonts w:ascii="Cambria Math" w:hAnsi="Cambria Math"/>
+                    </w:rPr>
+                    <m:t>Δ</m:t>
+                  </m:r>
                   <m:r>
                     <w:rPr>
                       <w:rFonts w:ascii="Cambria Math" w:hAnsi="Cambria Math"/>
@@ -19162,10 +18003,130 @@
                     <w:rPr>
                       <w:rFonts w:ascii="Cambria Math" w:hAnsi="Cambria Math"/>
                     </w:rPr>
-                    <m:t>rl</m:t>
+                    <m:t>r</m:t>
                   </m:r>
                 </m:sub>
-              </m:sSub>
+                <m:sup>
+                  <m:r>
+                    <w:rPr>
+                      <w:rFonts w:ascii="Cambria Math" w:hAnsi="Cambria Math"/>
+                    </w:rPr>
+                    <m:t>slip</m:t>
+                  </m:r>
+                </m:sup>
+              </m:sSubSup>
+              <m:r>
+                <w:rPr>
+                  <w:rFonts w:ascii="Cambria Math" w:hAnsi="Cambria Math"/>
+                </w:rPr>
+                <m:t>=</m:t>
+              </m:r>
+              <m:sSubSup>
+                <m:sSubSupPr>
+                  <m:ctrlPr>
+                    <w:rPr>
+                      <w:rFonts w:ascii="Cambria Math" w:hAnsi="Cambria Math"/>
+                      <w:i/>
+                    </w:rPr>
+                  </m:ctrlPr>
+                </m:sSubSupPr>
+                <m:e>
+                  <m:r>
+                    <w:rPr>
+                      <w:rFonts w:ascii="Cambria Math" w:hAnsi="Cambria Math"/>
+                    </w:rPr>
+                    <m:t>k</m:t>
+                  </m:r>
+                </m:e>
+                <m:sub>
+                  <m:r>
+                    <w:rPr>
+                      <w:rFonts w:ascii="Cambria Math" w:hAnsi="Cambria Math"/>
+                    </w:rPr>
+                    <m:t>r</m:t>
+                  </m:r>
+                </m:sub>
+                <m:sup>
+                  <m:r>
+                    <w:rPr>
+                      <w:rFonts w:ascii="Cambria Math" w:hAnsi="Cambria Math"/>
+                    </w:rPr>
+                    <m:t>drive</m:t>
+                  </m:r>
+                </m:sup>
+              </m:sSubSup>
+              <m:d>
+                <m:dPr>
+                  <m:begChr m:val="|"/>
+                  <m:endChr m:val="|"/>
+                  <m:ctrlPr>
+                    <w:rPr>
+                      <w:rFonts w:ascii="Cambria Math" w:hAnsi="Cambria Math"/>
+                      <w:i/>
+                    </w:rPr>
+                  </m:ctrlPr>
+                </m:dPr>
+                <m:e>
+                  <m:sSub>
+                    <m:sSubPr>
+                      <m:ctrlPr>
+                        <w:rPr>
+                          <w:rFonts w:ascii="Cambria Math" w:hAnsi="Cambria Math"/>
+                          <w:i/>
+                        </w:rPr>
+                      </m:ctrlPr>
+                    </m:sSubPr>
+                    <m:e>
+                      <m:r>
+                        <w:rPr>
+                          <w:rFonts w:ascii="Cambria Math" w:hAnsi="Cambria Math"/>
+                        </w:rPr>
+                        <m:t>T</m:t>
+                      </m:r>
+                    </m:e>
+                    <m:sub>
+                      <m:r>
+                        <w:rPr>
+                          <w:rFonts w:ascii="Cambria Math" w:hAnsi="Cambria Math"/>
+                        </w:rPr>
+                        <m:t>rl</m:t>
+                      </m:r>
+                    </m:sub>
+                  </m:sSub>
+                  <m:r>
+                    <w:rPr>
+                      <w:rFonts w:ascii="Cambria Math" w:hAnsi="Cambria Math"/>
+                    </w:rPr>
+                    <m:t>+</m:t>
+                  </m:r>
+                  <m:sSub>
+                    <m:sSubPr>
+                      <m:ctrlPr>
+                        <w:rPr>
+                          <w:rFonts w:ascii="Cambria Math" w:hAnsi="Cambria Math"/>
+                          <w:i/>
+                        </w:rPr>
+                      </m:ctrlPr>
+                    </m:sSubPr>
+                    <m:e>
+                      <m:r>
+                        <w:rPr>
+                          <w:rFonts w:ascii="Cambria Math" w:hAnsi="Cambria Math"/>
+                        </w:rPr>
+                        <m:t>T</m:t>
+                      </m:r>
+                    </m:e>
+                    <m:sub>
+                      <m:r>
+                        <w:rPr>
+                          <w:rFonts w:ascii="Cambria Math" w:hAnsi="Cambria Math"/>
+                        </w:rPr>
+                        <m:t>rr</m:t>
+                      </m:r>
+                    </m:sub>
+                  </m:sSub>
+                </m:e>
+              </m:d>
               <m:r>
                 <w:rPr>
                   <w:rFonts w:ascii="Cambria Math" w:hAnsi="Cambria Math"/>
@@ -19186,7 +18147,7 @@
                     <w:rPr>
                       <w:rFonts w:ascii="Cambria Math" w:hAnsi="Cambria Math"/>
                     </w:rPr>
-                    <m:t>T</m:t>
+                    <m:t>preload</m:t>
                   </m:r>
                 </m:e>
                 <m:sub>
@@ -19194,138 +18155,42 @@
                     <w:rPr>
                       <w:rFonts w:ascii="Cambria Math" w:hAnsi="Cambria Math"/>
                     </w:rPr>
-                    <m:t>rr</m:t>
+                    <m:t>r</m:t>
                   </m:r>
                 </m:sub>
               </m:sSub>
-            </m:e>
-          </m:d>
-          <m:f>
-            <m:fPr>
+              <m:r>
+                <w:rPr>
+                  <w:rFonts w:ascii="Cambria Math" w:hAnsi="Cambria Math"/>
+                </w:rPr>
+                <m:t>#</m:t>
+              </m:r>
+              <m:d>
+                <m:dPr>
+                  <m:ctrlPr>
+                    <w:rPr>
+                      <w:rFonts w:ascii="Cambria Math" w:eastAsiaTheme="minorEastAsia" w:hAnsi="Cambria Math"/>
+                      <w:i/>
+                    </w:rPr>
+                  </m:ctrlPr>
+                </m:dPr>
+                <m:e>
+                  <m:r>
+                    <w:rPr>
+                      <w:rFonts w:ascii="Cambria Math" w:eastAsiaTheme="minorEastAsia" w:hAnsi="Cambria Math"/>
+                    </w:rPr>
+                    <m:t>30</m:t>
+                  </m:r>
+                </m:e>
+              </m:d>
               <m:ctrlPr>
                 <w:rPr>
                   <w:rFonts w:ascii="Cambria Math" w:hAnsi="Cambria Math"/>
                   <w:i/>
                 </w:rPr>
               </m:ctrlPr>
-            </m:fPr>
-            <m:num>
-              <m:sSubSup>
-                <m:sSubSupPr>
-                  <m:ctrlPr>
-                    <w:rPr>
-                      <w:rFonts w:ascii="Cambria Math" w:eastAsiaTheme="minorEastAsia" w:hAnsi="Cambria Math"/>
-                      <w:i/>
-                    </w:rPr>
-                  </m:ctrlPr>
-                </m:sSubSupPr>
-                <m:e>
-                  <m:r>
-                    <w:rPr>
-                      <w:rFonts w:ascii="Cambria Math" w:eastAsiaTheme="minorEastAsia" w:hAnsi="Cambria Math"/>
-                    </w:rPr>
-                    <m:t>TBR</m:t>
-                  </m:r>
-                </m:e>
-                <m:sub>
-                  <m:r>
-                    <w:rPr>
-                      <w:rFonts w:ascii="Cambria Math" w:eastAsiaTheme="minorEastAsia" w:hAnsi="Cambria Math"/>
-                    </w:rPr>
-                    <m:t>r</m:t>
-                  </m:r>
-                </m:sub>
-                <m:sup>
-                  <m:r>
-                    <w:rPr>
-                      <w:rFonts w:ascii="Cambria Math" w:eastAsiaTheme="minorEastAsia" w:hAnsi="Cambria Math"/>
-                    </w:rPr>
-                    <m:t>brake</m:t>
-                  </m:r>
-                </m:sup>
-              </m:sSubSup>
-              <m:r>
-                <w:rPr>
-                  <w:rFonts w:ascii="Cambria Math" w:eastAsiaTheme="minorEastAsia" w:hAnsi="Cambria Math"/>
-                </w:rPr>
-                <m:t>-1</m:t>
-              </m:r>
-            </m:num>
-            <m:den>
-              <m:sSubSup>
-                <m:sSubSupPr>
-                  <m:ctrlPr>
-                    <w:rPr>
-                      <w:rFonts w:ascii="Cambria Math" w:eastAsiaTheme="minorEastAsia" w:hAnsi="Cambria Math"/>
-                      <w:i/>
-                    </w:rPr>
-                  </m:ctrlPr>
-                </m:sSubSupPr>
-                <m:e>
-                  <m:r>
-                    <w:rPr>
-                      <w:rFonts w:ascii="Cambria Math" w:eastAsiaTheme="minorEastAsia" w:hAnsi="Cambria Math"/>
-                    </w:rPr>
-                    <m:t>TBR</m:t>
-                  </m:r>
-                </m:e>
-                <m:sub>
-                  <m:r>
-                    <w:rPr>
-                      <w:rFonts w:ascii="Cambria Math" w:eastAsiaTheme="minorEastAsia" w:hAnsi="Cambria Math"/>
-                    </w:rPr>
-                    <m:t>r</m:t>
-                  </m:r>
-                </m:sub>
-                <m:sup>
-                  <m:r>
-                    <w:rPr>
-                      <w:rFonts w:ascii="Cambria Math" w:eastAsiaTheme="minorEastAsia" w:hAnsi="Cambria Math"/>
-                    </w:rPr>
-                    <m:t>brake</m:t>
-                  </m:r>
-                </m:sup>
-              </m:sSubSup>
-              <m:r>
-                <w:rPr>
-                  <w:rFonts w:ascii="Cambria Math" w:eastAsiaTheme="minorEastAsia" w:hAnsi="Cambria Math"/>
-                </w:rPr>
-                <m:t>+1</m:t>
-              </m:r>
-            </m:den>
-          </m:f>
-          <m:r>
-            <w:rPr>
-              <w:rFonts w:ascii="Cambria Math" w:hAnsi="Cambria Math"/>
-            </w:rPr>
-            <m:t>+</m:t>
-          </m:r>
-          <m:sSub>
-            <m:sSubPr>
-              <m:ctrlPr>
-                <w:rPr>
-                  <w:rFonts w:ascii="Cambria Math" w:hAnsi="Cambria Math"/>
-                  <w:i/>
-                </w:rPr>
-              </m:ctrlPr>
-            </m:sSubPr>
-            <m:e>
-              <m:r>
-                <w:rPr>
-                  <w:rFonts w:ascii="Cambria Math" w:hAnsi="Cambria Math"/>
-                </w:rPr>
-                <m:t>preload</m:t>
-              </m:r>
             </m:e>
-            <m:sub>
-              <m:r>
-                <w:rPr>
-                  <w:rFonts w:ascii="Cambria Math" w:hAnsi="Cambria Math"/>
-                </w:rPr>
-                <m:t>r</m:t>
-              </m:r>
-            </m:sub>
-          </m:sSub>
+          </m:eqArr>
         </m:oMath>
       </m:oMathPara>
     </w:p>
@@ -19474,7 +18339,28 @@
           <w:rFonts w:cs="Arial"/>
           <w:szCs w:val="24"/>
         </w:rPr>
-        <w:t>Equations 29 - 32</w:t>
+        <w:t xml:space="preserve">Equations </w:t>
+      </w:r>
+      <w:r>
+        <w:rPr>
+          <w:rFonts w:cs="Arial"/>
+          <w:szCs w:val="24"/>
+        </w:rPr>
+        <w:t>31</w:t>
+      </w:r>
+      <w:r>
+        <w:rPr>
+          <w:rFonts w:cs="Arial"/>
+          <w:szCs w:val="24"/>
+        </w:rPr>
+        <w:t xml:space="preserve"> - 3</w:t>
+      </w:r>
+      <w:r>
+        <w:rPr>
+          <w:rFonts w:cs="Arial"/>
+          <w:szCs w:val="24"/>
+        </w:rPr>
+        <w:t>4</w:t>
       </w:r>
       <w:r>
         <w:rPr>
@@ -19634,7 +18520,7 @@
                     <w:rPr>
                       <w:rFonts w:ascii="Cambria Math" w:hAnsi="Cambria Math"/>
                     </w:rPr>
-                    <m:t>29</m:t>
+                    <m:t>31</m:t>
                   </m:r>
                 </m:e>
               </m:d>
@@ -19792,7 +18678,13 @@
                     <w:rPr>
                       <w:rFonts w:ascii="Cambria Math" w:hAnsi="Cambria Math"/>
                     </w:rPr>
-                    <m:t>30</m:t>
+                    <m:t>3</m:t>
+                  </m:r>
+                  <m:r>
+                    <w:rPr>
+                      <w:rFonts w:ascii="Cambria Math" w:hAnsi="Cambria Math"/>
+                    </w:rPr>
+                    <m:t>2</m:t>
                   </m:r>
                 </m:e>
               </m:d>
@@ -20066,7 +18958,13 @@
                     <w:rPr>
                       <w:rFonts w:ascii="Cambria Math" w:hAnsi="Cambria Math"/>
                     </w:rPr>
-                    <m:t>31</m:t>
+                    <m:t>3</m:t>
+                  </m:r>
+                  <m:r>
+                    <w:rPr>
+                      <w:rFonts w:ascii="Cambria Math" w:hAnsi="Cambria Math"/>
+                    </w:rPr>
+                    <m:t>3</m:t>
                   </m:r>
                 </m:e>
               </m:d>
@@ -20188,7 +19086,13 @@
                     <w:rPr>
                       <w:rFonts w:ascii="Cambria Math" w:hAnsi="Cambria Math"/>
                     </w:rPr>
-                    <m:t>32</m:t>
+                    <m:t>3</m:t>
+                  </m:r>
+                  <m:r>
+                    <w:rPr>
+                      <w:rFonts w:ascii="Cambria Math" w:hAnsi="Cambria Math"/>
+                    </w:rPr>
+                    <m:t>4</m:t>
                   </m:r>
                 </m:e>
               </m:d>
@@ -20346,7 +19250,7 @@
           <w:rFonts w:eastAsiaTheme="minorEastAsia" w:cs="Arial"/>
           <w:szCs w:val="24"/>
         </w:rPr>
-        <w:t>29</w:t>
+        <w:t>31</w:t>
       </w:r>
       <w:r>
         <w:rPr>
@@ -20360,7 +19264,14 @@
           <w:rFonts w:eastAsiaTheme="minorEastAsia" w:cs="Arial"/>
           <w:szCs w:val="24"/>
         </w:rPr>
-        <w:t>30</w:t>
+        <w:t>3</w:t>
+      </w:r>
+      <w:r>
+        <w:rPr>
+          <w:rFonts w:eastAsiaTheme="minorEastAsia" w:cs="Arial"/>
+          <w:szCs w:val="24"/>
+        </w:rPr>
+        <w:t>2</w:t>
       </w:r>
       <w:r>
         <w:rPr>
@@ -20471,14 +19382,7 @@
                 <w:rFonts w:ascii="Cambria Math" w:eastAsiaTheme="minorEastAsia" w:hAnsi="Cambria Math" w:cs="Arial"/>
                 <w:szCs w:val="24"/>
               </w:rPr>
-              <m:t>x</m:t>
-            </m:r>
-            <m:r>
-              <w:rPr>
-                <w:rFonts w:ascii="Cambria Math" w:eastAsiaTheme="minorEastAsia" w:hAnsi="Cambria Math" w:cs="Arial"/>
-                <w:szCs w:val="24"/>
-              </w:rPr>
-              <m:t>, comb</m:t>
+              <m:t>x, comb</m:t>
             </m:r>
           </m:sub>
         </m:sSub>
@@ -20516,14 +19420,7 @@
                 <w:rFonts w:ascii="Cambria Math" w:eastAsiaTheme="minorEastAsia" w:hAnsi="Cambria Math" w:cs="Arial"/>
                 <w:szCs w:val="24"/>
               </w:rPr>
-              <m:t>y</m:t>
-            </m:r>
-            <m:r>
-              <w:rPr>
-                <w:rFonts w:ascii="Cambria Math" w:eastAsiaTheme="minorEastAsia" w:hAnsi="Cambria Math" w:cs="Arial"/>
-                <w:szCs w:val="24"/>
-              </w:rPr>
-              <m:t>,comb</m:t>
+              <m:t>y,comb</m:t>
             </m:r>
           </m:sub>
         </m:sSub>
@@ -20616,7 +19513,14 @@
           <w:rFonts w:eastAsiaTheme="minorEastAsia" w:cs="Arial"/>
           <w:szCs w:val="24"/>
         </w:rPr>
-        <w:t>33</w:t>
+        <w:t>3</w:t>
+      </w:r>
+      <w:r>
+        <w:rPr>
+          <w:rFonts w:eastAsiaTheme="minorEastAsia" w:cs="Arial"/>
+          <w:szCs w:val="24"/>
+        </w:rPr>
+        <w:t>5</w:t>
       </w:r>
       <w:r>
         <w:rPr>
@@ -20715,14 +19619,7 @@
                       <w:rFonts w:ascii="Cambria Math" w:hAnsi="Cambria Math" w:cs="Arial"/>
                       <w:szCs w:val="24"/>
                     </w:rPr>
-                    <m:t>x</m:t>
-                  </m:r>
-                  <m:r>
-                    <w:rPr>
-                      <w:rFonts w:ascii="Cambria Math" w:hAnsi="Cambria Math" w:cs="Arial"/>
-                      <w:szCs w:val="24"/>
-                    </w:rPr>
-                    <m:t>,comb,fl</m:t>
+                    <m:t>x,comb,fl</m:t>
                   </m:r>
                 </m:sub>
               </m:sSub>
@@ -20758,14 +19655,7 @@
                       <w:rFonts w:ascii="Cambria Math" w:hAnsi="Cambria Math" w:cs="Arial"/>
                       <w:szCs w:val="24"/>
                     </w:rPr>
-                    <m:t>rr</m:t>
-                  </m:r>
-                  <m:r>
-                    <w:rPr>
-                      <w:rFonts w:ascii="Cambria Math" w:hAnsi="Cambria Math" w:cs="Arial"/>
-                      <w:szCs w:val="24"/>
-                    </w:rPr>
-                    <m:t>,fl</m:t>
+                    <m:t>rr,fl</m:t>
                   </m:r>
                 </m:sub>
               </m:sSub>
@@ -20880,14 +19770,7 @@
                       <w:rFonts w:ascii="Cambria Math" w:hAnsi="Cambria Math" w:cs="Arial"/>
                       <w:szCs w:val="24"/>
                     </w:rPr>
-                    <m:t>x,comb,f</m:t>
-                  </m:r>
-                  <m:r>
-                    <w:rPr>
-                      <w:rFonts w:ascii="Cambria Math" w:hAnsi="Cambria Math" w:cs="Arial"/>
-                      <w:szCs w:val="24"/>
-                    </w:rPr>
-                    <m:t>r</m:t>
+                    <m:t>x,comb,fr</m:t>
                   </m:r>
                 </m:sub>
               </m:sSub>
@@ -20923,14 +19806,7 @@
                       <w:rFonts w:ascii="Cambria Math" w:hAnsi="Cambria Math" w:cs="Arial"/>
                       <w:szCs w:val="24"/>
                     </w:rPr>
-                    <m:t>rr,f</m:t>
-                  </m:r>
-                  <m:r>
-                    <w:rPr>
-                      <w:rFonts w:ascii="Cambria Math" w:hAnsi="Cambria Math" w:cs="Arial"/>
-                      <w:szCs w:val="24"/>
-                    </w:rPr>
-                    <m:t>r</m:t>
+                    <m:t>rr,fr</m:t>
                   </m:r>
                 </m:sub>
               </m:sSub>
@@ -20994,14 +19870,7 @@
                           <w:rFonts w:ascii="Cambria Math" w:hAnsi="Cambria Math" w:cs="Arial"/>
                           <w:szCs w:val="24"/>
                         </w:rPr>
-                        <m:t>f</m:t>
-                      </m:r>
-                      <m:r>
-                        <w:rPr>
-                          <w:rFonts w:ascii="Cambria Math" w:hAnsi="Cambria Math" w:cs="Arial"/>
-                          <w:szCs w:val="24"/>
-                        </w:rPr>
-                        <m:t>r</m:t>
+                        <m:t>fr</m:t>
                       </m:r>
                     </m:sub>
                   </m:sSub>
@@ -21064,21 +19933,7 @@
                       <w:rFonts w:ascii="Cambria Math" w:hAnsi="Cambria Math" w:cs="Arial"/>
                       <w:szCs w:val="24"/>
                     </w:rPr>
-                    <m:t>x,comb,</m:t>
-                  </m:r>
-                  <m:r>
-                    <w:rPr>
-                      <w:rFonts w:ascii="Cambria Math" w:hAnsi="Cambria Math" w:cs="Arial"/>
-                      <w:szCs w:val="24"/>
-                    </w:rPr>
-                    <m:t>r</m:t>
-                  </m:r>
-                  <m:r>
-                    <w:rPr>
-                      <w:rFonts w:ascii="Cambria Math" w:hAnsi="Cambria Math" w:cs="Arial"/>
-                      <w:szCs w:val="24"/>
-                    </w:rPr>
-                    <m:t>l</m:t>
+                    <m:t>x,comb,rl</m:t>
                   </m:r>
                 </m:sub>
               </m:sSub>
@@ -21114,21 +19969,7 @@
                       <w:rFonts w:ascii="Cambria Math" w:hAnsi="Cambria Math" w:cs="Arial"/>
                       <w:szCs w:val="24"/>
                     </w:rPr>
-                    <m:t>rr,</m:t>
-                  </m:r>
-                  <m:r>
-                    <w:rPr>
-                      <w:rFonts w:ascii="Cambria Math" w:hAnsi="Cambria Math" w:cs="Arial"/>
-                      <w:szCs w:val="24"/>
-                    </w:rPr>
-                    <m:t>r</m:t>
-                  </m:r>
-                  <m:r>
-                    <w:rPr>
-                      <w:rFonts w:ascii="Cambria Math" w:hAnsi="Cambria Math" w:cs="Arial"/>
-                      <w:szCs w:val="24"/>
-                    </w:rPr>
-                    <m:t>l</m:t>
+                    <m:t>rr,rl</m:t>
                   </m:r>
                 </m:sub>
               </m:sSub>
@@ -21192,14 +20033,7 @@
                           <w:rFonts w:ascii="Cambria Math" w:hAnsi="Cambria Math" w:cs="Arial"/>
                           <w:szCs w:val="24"/>
                         </w:rPr>
-                        <m:t>r</m:t>
-                      </m:r>
-                      <m:r>
-                        <w:rPr>
-                          <w:rFonts w:ascii="Cambria Math" w:hAnsi="Cambria Math" w:cs="Arial"/>
-                          <w:szCs w:val="24"/>
-                        </w:rPr>
-                        <m:t>l</m:t>
+                        <m:t>rl</m:t>
                       </m:r>
                     </m:sub>
                   </m:sSub>
@@ -21250,14 +20084,7 @@
                       <w:rFonts w:ascii="Cambria Math" w:hAnsi="Cambria Math" w:cs="Arial"/>
                       <w:szCs w:val="24"/>
                     </w:rPr>
-                    <m:t>x,comb,</m:t>
-                  </m:r>
-                  <m:r>
-                    <w:rPr>
-                      <w:rFonts w:ascii="Cambria Math" w:hAnsi="Cambria Math" w:cs="Arial"/>
-                      <w:szCs w:val="24"/>
-                    </w:rPr>
-                    <m:t>rr</m:t>
+                    <m:t>x,comb,rr</m:t>
                   </m:r>
                 </m:sub>
               </m:sSub>
@@ -21293,14 +20120,7 @@
                       <w:rFonts w:ascii="Cambria Math" w:hAnsi="Cambria Math" w:cs="Arial"/>
                       <w:szCs w:val="24"/>
                     </w:rPr>
-                    <m:t>rr,</m:t>
-                  </m:r>
-                  <m:r>
-                    <w:rPr>
-                      <w:rFonts w:ascii="Cambria Math" w:hAnsi="Cambria Math" w:cs="Arial"/>
-                      <w:szCs w:val="24"/>
-                    </w:rPr>
-                    <m:t>rr</m:t>
+                    <m:t>rr,rr</m:t>
                   </m:r>
                 </m:sub>
               </m:sSub>
@@ -21529,14 +20349,7 @@
                       <w:rFonts w:ascii="Cambria Math" w:hAnsi="Cambria Math" w:cs="Arial"/>
                       <w:szCs w:val="24"/>
                     </w:rPr>
-                    <m:t>y,comb,f</m:t>
-                  </m:r>
-                  <m:r>
-                    <w:rPr>
-                      <w:rFonts w:ascii="Cambria Math" w:hAnsi="Cambria Math" w:cs="Arial"/>
-                      <w:szCs w:val="24"/>
-                    </w:rPr>
-                    <m:t>r</m:t>
+                    <m:t>y,comb,fr</m:t>
                   </m:r>
                 </m:sub>
               </m:sSub>
@@ -21598,14 +20411,7 @@
                               <w:rFonts w:ascii="Cambria Math" w:hAnsi="Cambria Math" w:cs="Arial"/>
                               <w:szCs w:val="24"/>
                             </w:rPr>
-                            <m:t>f</m:t>
-                          </m:r>
-                          <m:r>
-                            <w:rPr>
-                              <w:rFonts w:ascii="Cambria Math" w:hAnsi="Cambria Math" w:cs="Arial"/>
-                              <w:szCs w:val="24"/>
-                            </w:rPr>
-                            <m:t>r</m:t>
+                            <m:t>fr</m:t>
                           </m:r>
                         </m:sub>
                       </m:sSub>
@@ -21634,7 +20440,13 @@
                     <w:rPr>
                       <w:rFonts w:ascii="Cambria Math" w:hAnsi="Cambria Math"/>
                     </w:rPr>
-                    <m:t>33</m:t>
+                    <m:t>3</m:t>
+                  </m:r>
+                  <m:r>
+                    <w:rPr>
+                      <w:rFonts w:ascii="Cambria Math" w:hAnsi="Cambria Math"/>
+                    </w:rPr>
+                    <m:t>5</m:t>
                   </m:r>
                 </m:e>
               </m:d>
@@ -21691,21 +20503,7 @@
                   <w:rFonts w:ascii="Cambria Math" w:hAnsi="Cambria Math" w:cs="Arial"/>
                   <w:szCs w:val="24"/>
                 </w:rPr>
-                <m:t>y,comb,</m:t>
-              </m:r>
-              <m:r>
-                <w:rPr>
-                  <w:rFonts w:ascii="Cambria Math" w:hAnsi="Cambria Math" w:cs="Arial"/>
-                  <w:szCs w:val="24"/>
-                </w:rPr>
-                <m:t>r</m:t>
-              </m:r>
-              <m:r>
-                <w:rPr>
-                  <w:rFonts w:ascii="Cambria Math" w:hAnsi="Cambria Math" w:cs="Arial"/>
-                  <w:szCs w:val="24"/>
-                </w:rPr>
-                <m:t>l</m:t>
+                <m:t>y,comb,rl</m:t>
               </m:r>
             </m:sub>
           </m:sSub>
@@ -21767,14 +20565,7 @@
                           <w:rFonts w:ascii="Cambria Math" w:hAnsi="Cambria Math" w:cs="Arial"/>
                           <w:szCs w:val="24"/>
                         </w:rPr>
-                        <m:t>r</m:t>
-                      </m:r>
-                      <m:r>
-                        <w:rPr>
-                          <w:rFonts w:ascii="Cambria Math" w:hAnsi="Cambria Math" w:cs="Arial"/>
-                          <w:szCs w:val="24"/>
-                        </w:rPr>
-                        <m:t>l</m:t>
+                        <m:t>rl</m:t>
                       </m:r>
                     </m:sub>
                   </m:sSub>
@@ -21814,14 +20605,7 @@
                   <w:rFonts w:ascii="Cambria Math" w:hAnsi="Cambria Math" w:cs="Arial"/>
                   <w:szCs w:val="24"/>
                 </w:rPr>
-                <m:t>y,comb,</m:t>
-              </m:r>
-              <m:r>
-                <w:rPr>
-                  <w:rFonts w:ascii="Cambria Math" w:hAnsi="Cambria Math" w:cs="Arial"/>
-                  <w:szCs w:val="24"/>
-                </w:rPr>
-                <m:t>rr</m:t>
+                <m:t>y,comb,rr</m:t>
               </m:r>
             </m:sub>
           </m:sSub>
@@ -21949,97 +20733,139 @@
           <w:rFonts w:cs="Arial"/>
           <w:szCs w:val="24"/>
         </w:rPr>
-        <w:t>33</w:t>
+        <w:t>3</w:t>
       </w:r>
       <w:r>
         <w:rPr>
           <w:rFonts w:cs="Arial"/>
           <w:szCs w:val="24"/>
         </w:rPr>
-        <w:t xml:space="preserve"> into Equation </w:t>
+        <w:t>5</w:t>
       </w:r>
       <w:r>
         <w:rPr>
           <w:rFonts w:cs="Arial"/>
           <w:szCs w:val="24"/>
         </w:rPr>
-        <w:t>32</w:t>
+        <w:t xml:space="preserve"> into Equation </w:t>
       </w:r>
       <w:r>
         <w:rPr>
           <w:rFonts w:cs="Arial"/>
           <w:szCs w:val="24"/>
         </w:rPr>
-        <w:t xml:space="preserve"> and using the definitions given by Equations </w:t>
+        <w:t>3</w:t>
       </w:r>
       <w:r>
         <w:rPr>
           <w:rFonts w:cs="Arial"/>
           <w:szCs w:val="24"/>
         </w:rPr>
-        <w:t>29</w:t>
+        <w:t>4</w:t>
       </w:r>
       <w:r>
         <w:rPr>
           <w:rFonts w:cs="Arial"/>
           <w:szCs w:val="24"/>
         </w:rPr>
-        <w:t xml:space="preserve">, </w:t>
+        <w:t xml:space="preserve"> and using the definitions given by Equations </w:t>
       </w:r>
       <w:r>
         <w:rPr>
           <w:rFonts w:cs="Arial"/>
           <w:szCs w:val="24"/>
         </w:rPr>
-        <w:t>30</w:t>
+        <w:t>31</w:t>
       </w:r>
       <w:r>
         <w:rPr>
           <w:rFonts w:cs="Arial"/>
           <w:szCs w:val="24"/>
         </w:rPr>
-        <w:t xml:space="preserve"> and </w:t>
+        <w:t xml:space="preserve">, </w:t>
       </w:r>
       <w:r>
         <w:rPr>
           <w:rFonts w:cs="Arial"/>
           <w:szCs w:val="24"/>
         </w:rPr>
-        <w:t>31</w:t>
+        <w:t>3</w:t>
       </w:r>
       <w:r>
         <w:rPr>
           <w:rFonts w:cs="Arial"/>
           <w:szCs w:val="24"/>
         </w:rPr>
-        <w:t xml:space="preserve">, it is possible to isolate a single combined longitudinal tire force, which may be used as a longitudinal tire force target for the critical tire. The equation is written differently depending on what tire is considered critical. Equations </w:t>
+        <w:t>2</w:t>
       </w:r>
       <w:r>
         <w:rPr>
           <w:rFonts w:cs="Arial"/>
           <w:szCs w:val="24"/>
         </w:rPr>
-        <w:t>34</w:t>
+        <w:t xml:space="preserve"> and </w:t>
       </w:r>
       <w:r>
         <w:rPr>
           <w:rFonts w:cs="Arial"/>
           <w:szCs w:val="24"/>
         </w:rPr>
-        <w:t xml:space="preserve"> and </w:t>
+        <w:t>3</w:t>
       </w:r>
       <w:r>
         <w:rPr>
           <w:rFonts w:cs="Arial"/>
           <w:szCs w:val="24"/>
         </w:rPr>
-        <w:t>35</w:t>
+        <w:t>3</w:t>
       </w:r>
       <w:r>
         <w:rPr>
           <w:rFonts w:cs="Arial"/>
           <w:szCs w:val="24"/>
         </w:rPr>
+        <w:t xml:space="preserve">, it is possible to isolate a single combined longitudinal tire force, which may be used as a longitudinal tire force target for the critical tire. The equation is written differently depending on what tire is considered critical. Equations </w:t>
+      </w:r>
+      <w:r>
+        <w:rPr>
+          <w:rFonts w:cs="Arial"/>
+          <w:szCs w:val="24"/>
+        </w:rPr>
+        <w:t>3</w:t>
+      </w:r>
+      <w:r>
+        <w:rPr>
+          <w:rFonts w:cs="Arial"/>
+          <w:szCs w:val="24"/>
+        </w:rPr>
+        <w:t>6</w:t>
+      </w:r>
+      <w:r>
+        <w:rPr>
+          <w:rFonts w:cs="Arial"/>
+          <w:szCs w:val="24"/>
+        </w:rPr>
+        <w:t xml:space="preserve"> and </w:t>
+      </w:r>
+      <w:r>
+        <w:rPr>
+          <w:rFonts w:cs="Arial"/>
+          <w:szCs w:val="24"/>
+        </w:rPr>
+        <w:t>3</w:t>
+      </w:r>
+      <w:r>
+        <w:rPr>
+          <w:rFonts w:cs="Arial"/>
+          <w:szCs w:val="24"/>
+        </w:rPr>
+        <w:t>7</w:t>
+      </w:r>
+      <w:r>
+        <w:rPr>
+          <w:rFonts w:cs="Arial"/>
+          <w:szCs w:val="24"/>
+        </w:rPr>
         <w:t xml:space="preserve"> give examples for a front left critical tire for </w:t>
       </w:r>
       <m:oMath>
@@ -22048,14 +20874,7 @@
             <w:rFonts w:ascii="Cambria Math" w:hAnsi="Cambria Math" w:cs="Arial"/>
             <w:szCs w:val="24"/>
           </w:rPr>
-          <m:t>bias</m:t>
-        </m:r>
-        <m:r>
-          <w:rPr>
-            <w:rFonts w:ascii="Cambria Math" w:hAnsi="Cambria Math" w:cs="Arial"/>
-            <w:szCs w:val="24"/>
-          </w:rPr>
-          <m:t>&gt;50%</m:t>
+          <m:t>bias&gt;50%</m:t>
         </m:r>
       </m:oMath>
       <w:r>
@@ -22148,6 +20967,14 @@
                 </w:rPr>
                 <m:t>=</m:t>
               </m:r>
+              <m:ctrlPr>
+                <w:rPr>
+                  <w:rFonts w:ascii="Cambria Math" w:eastAsia="Cambria Math" w:hAnsi="Cambria Math" w:cs="Cambria Math"/>
+                  <w:i/>
+                </w:rPr>
+              </m:ctrlPr>
+            </m:e>
+            <m:e>
               <m:f>
                 <m:fPr>
                   <m:ctrlPr>
@@ -22349,14 +21176,7 @@
                               <w:rFonts w:ascii="Cambria Math" w:eastAsiaTheme="minorEastAsia" w:hAnsi="Cambria Math" w:cs="Arial"/>
                               <w:szCs w:val="24"/>
                             </w:rPr>
-                            <m:t>-</m:t>
-                          </m:r>
-                          <m:r>
-                            <w:rPr>
-                              <w:rFonts w:ascii="Cambria Math" w:eastAsiaTheme="minorEastAsia" w:hAnsi="Cambria Math" w:cs="Arial"/>
-                              <w:szCs w:val="24"/>
-                            </w:rPr>
-                            <m:t>∆T</m:t>
+                            <m:t>-∆T</m:t>
                           </m:r>
                         </m:e>
                         <m:sub>
@@ -22827,14 +21647,7 @@
                                   <w:rFonts w:ascii="Cambria Math" w:eastAsiaTheme="minorEastAsia" w:hAnsi="Cambria Math" w:cs="Arial"/>
                                   <w:szCs w:val="24"/>
                                 </w:rPr>
-                                <m:t>f</m:t>
-                              </m:r>
-                              <m:r>
-                                <w:rPr>
-                                  <w:rFonts w:ascii="Cambria Math" w:eastAsiaTheme="minorEastAsia" w:hAnsi="Cambria Math" w:cs="Arial"/>
-                                  <w:szCs w:val="24"/>
-                                </w:rPr>
-                                <m:t>l</m:t>
+                                <m:t>fl</m:t>
                               </m:r>
                             </m:sub>
                           </m:sSub>
@@ -23228,14 +22041,7 @@
                                   <w:rFonts w:ascii="Cambria Math" w:eastAsiaTheme="minorEastAsia" w:hAnsi="Cambria Math" w:cs="Arial"/>
                                   <w:szCs w:val="24"/>
                                 </w:rPr>
-                                <m:t>r</m:t>
-                              </m:r>
-                              <m:r>
-                                <w:rPr>
-                                  <w:rFonts w:ascii="Cambria Math" w:eastAsiaTheme="minorEastAsia" w:hAnsi="Cambria Math" w:cs="Arial"/>
-                                  <w:szCs w:val="24"/>
-                                </w:rPr>
-                                <m:t>r</m:t>
+                                <m:t>rr</m:t>
                               </m:r>
                             </m:sub>
                           </m:sSub>
@@ -23310,14 +22116,7 @@
                               <w:rFonts w:ascii="Cambria Math" w:eastAsiaTheme="minorEastAsia" w:hAnsi="Cambria Math" w:cs="Arial"/>
                               <w:szCs w:val="24"/>
                             </w:rPr>
-                            <m:t>r</m:t>
-                          </m:r>
-                          <m:r>
-                            <w:rPr>
-                              <w:rFonts w:ascii="Cambria Math" w:eastAsiaTheme="minorEastAsia" w:hAnsi="Cambria Math" w:cs="Arial"/>
-                              <w:szCs w:val="24"/>
-                            </w:rPr>
-                            <m:t>r</m:t>
+                            <m:t>rr</m:t>
                           </m:r>
                         </m:sub>
                       </m:sSub>
@@ -23375,7 +22174,7 @@
                     <w:rPr>
                       <w:rFonts w:ascii="Cambria Math" w:hAnsi="Cambria Math"/>
                     </w:rPr>
-                    <m:t>34</m:t>
+                    <m:t>36</m:t>
                   </m:r>
                 </m:e>
               </m:d>
@@ -23383,6 +22182,15 @@
           </m:eqArr>
         </m:oMath>
       </m:oMathPara>
+    </w:p>
+    <w:p>
+      <w:pPr>
+        <w:ind w:firstLine="0"/>
+        <w:rPr>
+          <w:rFonts w:eastAsiaTheme="minorEastAsia" w:cs="Arial"/>
+          <w:szCs w:val="24"/>
+        </w:rPr>
+      </w:pPr>
     </w:p>
     <w:p>
       <w:pPr>
@@ -23444,6 +22252,14 @@
                 </w:rPr>
                 <m:t>=</m:t>
               </m:r>
+              <m:ctrlPr>
+                <w:rPr>
+                  <w:rFonts w:ascii="Cambria Math" w:eastAsia="Cambria Math" w:hAnsi="Cambria Math" w:cs="Cambria Math"/>
+                  <w:i/>
+                </w:rPr>
+              </m:ctrlPr>
+            </m:e>
+            <m:e>
               <m:f>
                 <m:fPr>
                   <m:ctrlPr>
@@ -23786,14 +22602,7 @@
                               <w:rFonts w:ascii="Cambria Math" w:eastAsiaTheme="minorEastAsia" w:hAnsi="Cambria Math" w:cs="Arial"/>
                               <w:szCs w:val="24"/>
                             </w:rPr>
-                            <m:t>1-</m:t>
-                          </m:r>
-                          <m:r>
-                            <w:rPr>
-                              <w:rFonts w:ascii="Cambria Math" w:eastAsiaTheme="minorEastAsia" w:hAnsi="Cambria Math" w:cs="Arial"/>
-                              <w:szCs w:val="24"/>
-                            </w:rPr>
-                            <m:t>bias</m:t>
+                            <m:t>1-bias</m:t>
                           </m:r>
                         </m:den>
                       </m:f>
@@ -24019,14 +22828,7 @@
                               <w:rFonts w:ascii="Cambria Math" w:eastAsiaTheme="minorEastAsia" w:hAnsi="Cambria Math" w:cs="Arial"/>
                               <w:szCs w:val="24"/>
                             </w:rPr>
-                            <m:t>1-</m:t>
-                          </m:r>
-                          <m:r>
-                            <w:rPr>
-                              <w:rFonts w:ascii="Cambria Math" w:eastAsiaTheme="minorEastAsia" w:hAnsi="Cambria Math" w:cs="Arial"/>
-                              <w:szCs w:val="24"/>
-                            </w:rPr>
-                            <m:t>bias</m:t>
+                            <m:t>1-bias</m:t>
                           </m:r>
                         </m:den>
                       </m:f>
@@ -24455,14 +23257,7 @@
                           <w:rFonts w:ascii="Cambria Math" w:eastAsiaTheme="minorEastAsia" w:hAnsi="Cambria Math" w:cs="Arial"/>
                           <w:szCs w:val="24"/>
                         </w:rPr>
-                        <m:t>1-</m:t>
-                      </m:r>
-                      <m:r>
-                        <w:rPr>
-                          <w:rFonts w:ascii="Cambria Math" w:eastAsiaTheme="minorEastAsia" w:hAnsi="Cambria Math" w:cs="Arial"/>
-                          <w:szCs w:val="24"/>
-                        </w:rPr>
-                        <m:t>bias</m:t>
+                        <m:t>1-bias</m:t>
                       </m:r>
                     </m:den>
                   </m:f>
@@ -24637,14 +23432,7 @@
                           <w:rFonts w:ascii="Cambria Math" w:eastAsiaTheme="minorEastAsia" w:hAnsi="Cambria Math" w:cs="Arial"/>
                           <w:szCs w:val="24"/>
                         </w:rPr>
-                        <m:t>1-</m:t>
-                      </m:r>
-                      <m:r>
-                        <w:rPr>
-                          <w:rFonts w:ascii="Cambria Math" w:eastAsiaTheme="minorEastAsia" w:hAnsi="Cambria Math" w:cs="Arial"/>
-                          <w:szCs w:val="24"/>
-                        </w:rPr>
-                        <m:t>bias</m:t>
+                        <m:t>1-bias</m:t>
                       </m:r>
                     </m:den>
                   </m:f>
@@ -24671,7 +23459,7 @@
                     <w:rPr>
                       <w:rFonts w:ascii="Cambria Math" w:hAnsi="Cambria Math"/>
                     </w:rPr>
-                    <m:t>35</m:t>
+                    <m:t>37</m:t>
                   </m:r>
                 </m:e>
               </m:d>
@@ -25654,7 +24442,13 @@
                     <w:rPr>
                       <w:rFonts w:ascii="Cambria Math" w:hAnsi="Cambria Math"/>
                     </w:rPr>
-                    <m:t>36</m:t>
+                    <m:t>3</m:t>
+                  </m:r>
+                  <m:r>
+                    <w:rPr>
+                      <w:rFonts w:ascii="Cambria Math" w:hAnsi="Cambria Math"/>
+                    </w:rPr>
+                    <m:t>8</m:t>
                   </m:r>
                 </m:e>
               </m:d>
@@ -25737,7 +24531,6 @@
           <w:rFonts w:cs="Arial"/>
           <w:szCs w:val="24"/>
         </w:rPr>
-        <w:lastRenderedPageBreak/>
         <w:t>The force target</w:t>
       </w:r>
       <w:r>
@@ -26143,10 +24936,7 @@
         <w:fldChar w:fldCharType="end"/>
       </w:r>
       <w:r>
-        <w:t xml:space="preserve"> </w:t>
-      </w:r>
-      <w:r>
-        <w:t>– Generic representation of a constant velocity YMD</w:t>
+        <w:t xml:space="preserve"> – Generic representation of a constant velocity YMD</w:t>
       </w:r>
       <w:bookmarkEnd w:id="16"/>
     </w:p>
@@ -26231,13 +25021,7 @@
     </w:p>
     <w:p>
       <w:r>
-        <w:t xml:space="preserve">Constant </w:t>
-      </w:r>
-      <w:r>
-        <w:t>cornering radius</w:t>
-      </w:r>
-      <w:r>
-        <w:t xml:space="preserve"> YMDs tend to have an iconic “</w:t>
+        <w:t>Constant cornering radius YMDs tend to have an iconic “</w:t>
       </w:r>
       <w:r>
         <w:t>split</w:t>
@@ -26309,13 +25093,7 @@
         <w:t xml:space="preserve">– </w:t>
       </w:r>
       <w:r>
-        <w:t xml:space="preserve">Generic representation of a constant </w:t>
-      </w:r>
-      <w:r>
-        <w:t>cornering radius</w:t>
-      </w:r>
-      <w:r>
-        <w:t xml:space="preserve"> YMD</w:t>
+        <w:t>Generic representation of a constant cornering radius YMD</w:t>
       </w:r>
       <w:bookmarkEnd w:id="18"/>
     </w:p>
@@ -26577,67 +25355,53 @@
           <w:b/>
           <w:bCs/>
         </w:rPr>
-        <w:t xml:space="preserve">Development </w:t>
+        <w:t>Development of a Four-Wheel Quasi-Steady State Numerical Model for Vehicle Dynamics Simulation</w:t>
+      </w:r>
+      <w:r>
+        <w:t xml:space="preserve">. </w:t>
+      </w:r>
+      <w:r>
+        <w:t>Bachelor’s Thesis in Mechanical Engineering</w:t>
+      </w:r>
+      <w:r>
+        <w:t xml:space="preserve"> – </w:t>
+      </w:r>
+      <w:proofErr w:type="spellStart"/>
+      <w:r>
+        <w:t>Universidade</w:t>
+      </w:r>
+      <w:proofErr w:type="spellEnd"/>
+      <w:r>
+        <w:t xml:space="preserve"> Federal de Santa Catarina, Florianópolis, 2025.</w:t>
+      </w:r>
+    </w:p>
+    <w:p>
+      <w:pPr>
+        <w:ind w:firstLine="0"/>
+      </w:pPr>
+    </w:p>
+    <w:p>
+      <w:pPr>
+        <w:ind w:firstLine="0"/>
+      </w:pPr>
+      <w:r>
+        <w:t>GUIGGIANI</w:t>
+      </w:r>
+      <w:r>
+        <w:t xml:space="preserve">, </w:t>
+      </w:r>
+      <w:r>
+        <w:t>M</w:t>
+      </w:r>
+      <w:r>
+        <w:t xml:space="preserve">. </w:t>
       </w:r>
       <w:r>
         <w:rPr>
           <w:b/>
           <w:bCs/>
         </w:rPr>
-        <w:t>of a Four-Wheel Quasi-Steady State Numerical Model for Vehicle Dynamics Simulation</w:t>
-      </w:r>
-      <w:r>
-        <w:t xml:space="preserve">. </w:t>
-      </w:r>
-      <w:r>
-        <w:t>Bachelor’s Thesis in Mechanical Engineering</w:t>
-      </w:r>
-      <w:r>
-        <w:t xml:space="preserve"> – </w:t>
-      </w:r>
-      <w:proofErr w:type="spellStart"/>
-      <w:r>
-        <w:t>Universidade</w:t>
-      </w:r>
-      <w:proofErr w:type="spellEnd"/>
-      <w:r>
-        <w:t xml:space="preserve"> Federal de Santa Catarina, Florianópolis, 2025.</w:t>
-      </w:r>
-    </w:p>
-    <w:p>
-      <w:pPr>
-        <w:ind w:firstLine="0"/>
-      </w:pPr>
-    </w:p>
-    <w:p>
-      <w:pPr>
-        <w:ind w:firstLine="0"/>
-      </w:pPr>
-      <w:r>
-        <w:t>GUIGGIANI</w:t>
-      </w:r>
-      <w:r>
-        <w:t xml:space="preserve">, </w:t>
-      </w:r>
-      <w:r>
-        <w:t>M</w:t>
-      </w:r>
-      <w:r>
-        <w:t xml:space="preserve">. </w:t>
-      </w:r>
-      <w:r>
-        <w:rPr>
-          <w:b/>
-          <w:bCs/>
-        </w:rPr>
-        <w:t>The Science of</w:t>
-      </w:r>
-      <w:r>
-        <w:rPr>
-          <w:b/>
-          <w:bCs/>
-        </w:rPr>
-        <w:t xml:space="preserve"> Vehicle Dynamics</w:t>
+        <w:t>The Science of Vehicle Dynamics</w:t>
       </w:r>
       <w:r>
         <w:t>: Handling, Braking and Rid of Road and Race Cars</w:t>
@@ -26989,19 +25753,7 @@
           <w:rPr>
             <w:rFonts w:ascii="Cambria Math" w:eastAsiaTheme="minorEastAsia" w:hAnsi="Cambria Math"/>
           </w:rPr>
-          <m:t>=</m:t>
-        </m:r>
-        <m:r>
-          <w:rPr>
-            <w:rFonts w:ascii="Cambria Math" w:eastAsiaTheme="minorEastAsia" w:hAnsi="Cambria Math"/>
-          </w:rPr>
-          <m:t>-1</m:t>
-        </m:r>
-        <m:r>
-          <w:rPr>
-            <w:rFonts w:ascii="Cambria Math" w:eastAsiaTheme="minorEastAsia" w:hAnsi="Cambria Math"/>
-          </w:rPr>
-          <m:t xml:space="preserve"> g</m:t>
+          <m:t>=-1 g</m:t>
         </m:r>
       </m:oMath>
       <w:r>
@@ -27174,19 +25926,7 @@
           <w:rPr>
             <w:rFonts w:ascii="Cambria Math" w:eastAsiaTheme="minorEastAsia" w:hAnsi="Cambria Math"/>
           </w:rPr>
-          <m:t>=0</m:t>
-        </m:r>
-        <m:r>
-          <w:rPr>
-            <w:rFonts w:ascii="Cambria Math" w:eastAsiaTheme="minorEastAsia" w:hAnsi="Cambria Math"/>
-          </w:rPr>
-          <m:t>.5</m:t>
-        </m:r>
-        <m:r>
-          <w:rPr>
-            <w:rFonts w:ascii="Cambria Math" w:eastAsiaTheme="minorEastAsia" w:hAnsi="Cambria Math"/>
-          </w:rPr>
-          <m:t xml:space="preserve"> g</m:t>
+          <m:t>=0.5 g</m:t>
         </m:r>
       </m:oMath>
       <w:r>
@@ -27355,38 +26095,14 @@
           <w:rPr>
             <w:rFonts w:ascii="Cambria Math" w:eastAsiaTheme="minorEastAsia" w:hAnsi="Cambria Math"/>
           </w:rPr>
-          <m:t>=</m:t>
-        </m:r>
-        <m:r>
-          <w:rPr>
-            <w:rFonts w:ascii="Cambria Math" w:eastAsiaTheme="minorEastAsia" w:hAnsi="Cambria Math"/>
-          </w:rPr>
-          <m:t>0.5</m:t>
-        </m:r>
-        <m:r>
-          <w:rPr>
-            <w:rFonts w:ascii="Cambria Math" w:eastAsiaTheme="minorEastAsia" w:hAnsi="Cambria Math"/>
-          </w:rPr>
-          <m:t xml:space="preserve"> g</m:t>
+          <m:t>=0.5 g</m:t>
         </m:r>
       </m:oMath>
       <w:r>
         <w:rPr>
           <w:rFonts w:eastAsiaTheme="minorEastAsia"/>
         </w:rPr>
-        <w:t xml:space="preserve">, </w:t>
-      </w:r>
-      <w:r>
-        <w:rPr>
-          <w:rFonts w:eastAsiaTheme="minorEastAsia"/>
-        </w:rPr>
-        <w:t>geared</w:t>
-      </w:r>
-      <w:r>
-        <w:rPr>
-          <w:rFonts w:eastAsiaTheme="minorEastAsia"/>
-        </w:rPr>
-        <w:t xml:space="preserve"> differential</w:t>
+        <w:t>, geared differential</w:t>
       </w:r>
       <w:bookmarkEnd w:id="27"/>
     </w:p>
@@ -27534,44 +26250,14 @@
         <w:t xml:space="preserve"> – </w:t>
       </w:r>
       <w:r>
-        <w:t xml:space="preserve">Constant </w:t>
-      </w:r>
-      <w:r>
-        <w:t>cornering radius</w:t>
-      </w:r>
-      <w:r>
-        <w:t xml:space="preserve"> YMD for </w:t>
+        <w:t xml:space="preserve">Constant cornering radius YMD for </w:t>
       </w:r>
       <m:oMath>
         <m:r>
           <w:rPr>
             <w:rFonts w:ascii="Cambria Math" w:hAnsi="Cambria Math"/>
           </w:rPr>
-          <m:t>R</m:t>
-        </m:r>
-        <m:r>
-          <w:rPr>
-            <w:rFonts w:ascii="Cambria Math" w:hAnsi="Cambria Math"/>
-          </w:rPr>
-          <m:t>=</m:t>
-        </m:r>
-        <m:r>
-          <w:rPr>
-            <w:rFonts w:ascii="Cambria Math" w:hAnsi="Cambria Math"/>
-          </w:rPr>
-          <m:t>30</m:t>
-        </m:r>
-        <m:r>
-          <w:rPr>
-            <w:rFonts w:ascii="Cambria Math" w:hAnsi="Cambria Math"/>
-          </w:rPr>
-          <m:t xml:space="preserve"> </m:t>
-        </m:r>
-        <m:r>
-          <w:rPr>
-            <w:rFonts w:ascii="Cambria Math" w:hAnsi="Cambria Math"/>
-          </w:rPr>
-          <m:t>m</m:t>
+          <m:t>R=30 m</m:t>
         </m:r>
       </m:oMath>
       <w:r>
@@ -27732,31 +26418,7 @@
           <w:rPr>
             <w:rFonts w:ascii="Cambria Math" w:hAnsi="Cambria Math"/>
           </w:rPr>
-          <m:t>R</m:t>
-        </m:r>
-        <m:r>
-          <w:rPr>
-            <w:rFonts w:ascii="Cambria Math" w:hAnsi="Cambria Math"/>
-          </w:rPr>
-          <m:t>=</m:t>
-        </m:r>
-        <m:r>
-          <w:rPr>
-            <w:rFonts w:ascii="Cambria Math" w:hAnsi="Cambria Math"/>
-          </w:rPr>
-          <m:t>30</m:t>
-        </m:r>
-        <m:r>
-          <w:rPr>
-            <w:rFonts w:ascii="Cambria Math" w:hAnsi="Cambria Math"/>
-          </w:rPr>
-          <m:t xml:space="preserve"> </m:t>
-        </m:r>
-        <m:r>
-          <w:rPr>
-            <w:rFonts w:ascii="Cambria Math" w:hAnsi="Cambria Math"/>
-          </w:rPr>
-          <m:t>m</m:t>
+          <m:t>R=30 m</m:t>
         </m:r>
       </m:oMath>
       <w:r>
@@ -27797,19 +26459,7 @@
           <w:rPr>
             <w:rFonts w:ascii="Cambria Math" w:eastAsiaTheme="minorEastAsia" w:hAnsi="Cambria Math"/>
           </w:rPr>
-          <m:t>=</m:t>
-        </m:r>
-        <m:r>
-          <w:rPr>
-            <w:rFonts w:ascii="Cambria Math" w:eastAsiaTheme="minorEastAsia" w:hAnsi="Cambria Math"/>
-          </w:rPr>
-          <m:t>-1</m:t>
-        </m:r>
-        <m:r>
-          <w:rPr>
-            <w:rFonts w:ascii="Cambria Math" w:eastAsiaTheme="minorEastAsia" w:hAnsi="Cambria Math"/>
-          </w:rPr>
-          <m:t xml:space="preserve"> g</m:t>
+          <m:t>=-1 g</m:t>
         </m:r>
       </m:oMath>
       <w:r>
@@ -27929,31 +26579,7 @@
           <w:rPr>
             <w:rFonts w:ascii="Cambria Math" w:hAnsi="Cambria Math"/>
           </w:rPr>
-          <m:t>R</m:t>
-        </m:r>
-        <m:r>
-          <w:rPr>
-            <w:rFonts w:ascii="Cambria Math" w:hAnsi="Cambria Math"/>
-          </w:rPr>
-          <m:t>=</m:t>
-        </m:r>
-        <m:r>
-          <w:rPr>
-            <w:rFonts w:ascii="Cambria Math" w:hAnsi="Cambria Math"/>
-          </w:rPr>
-          <m:t>30</m:t>
-        </m:r>
-        <m:r>
-          <w:rPr>
-            <w:rFonts w:ascii="Cambria Math" w:hAnsi="Cambria Math"/>
-          </w:rPr>
-          <m:t xml:space="preserve"> </m:t>
-        </m:r>
-        <m:r>
-          <w:rPr>
-            <w:rFonts w:ascii="Cambria Math" w:hAnsi="Cambria Math"/>
-          </w:rPr>
-          <m:t>m</m:t>
+          <m:t>R=30 m</m:t>
         </m:r>
       </m:oMath>
       <w:r>
@@ -27994,19 +26620,7 @@
           <w:rPr>
             <w:rFonts w:ascii="Cambria Math" w:eastAsiaTheme="minorEastAsia" w:hAnsi="Cambria Math"/>
           </w:rPr>
-          <m:t>=</m:t>
-        </m:r>
-        <m:r>
-          <w:rPr>
-            <w:rFonts w:ascii="Cambria Math" w:eastAsiaTheme="minorEastAsia" w:hAnsi="Cambria Math"/>
-          </w:rPr>
-          <m:t>0.5</m:t>
-        </m:r>
-        <m:r>
-          <w:rPr>
-            <w:rFonts w:ascii="Cambria Math" w:eastAsiaTheme="minorEastAsia" w:hAnsi="Cambria Math"/>
-          </w:rPr>
-          <m:t xml:space="preserve"> g</m:t>
+          <m:t>=0.5 g</m:t>
         </m:r>
       </m:oMath>
       <w:r>
@@ -28132,31 +26746,7 @@
           <w:rPr>
             <w:rFonts w:ascii="Cambria Math" w:hAnsi="Cambria Math"/>
           </w:rPr>
-          <m:t>R</m:t>
-        </m:r>
-        <m:r>
-          <w:rPr>
-            <w:rFonts w:ascii="Cambria Math" w:hAnsi="Cambria Math"/>
-          </w:rPr>
-          <m:t>=</m:t>
-        </m:r>
-        <m:r>
-          <w:rPr>
-            <w:rFonts w:ascii="Cambria Math" w:hAnsi="Cambria Math"/>
-          </w:rPr>
-          <m:t>30</m:t>
-        </m:r>
-        <m:r>
-          <w:rPr>
-            <w:rFonts w:ascii="Cambria Math" w:hAnsi="Cambria Math"/>
-          </w:rPr>
-          <m:t xml:space="preserve"> </m:t>
-        </m:r>
-        <m:r>
-          <w:rPr>
-            <w:rFonts w:ascii="Cambria Math" w:hAnsi="Cambria Math"/>
-          </w:rPr>
-          <m:t>m</m:t>
+          <m:t>R=30 m</m:t>
         </m:r>
       </m:oMath>
       <w:r>
@@ -28197,38 +26787,14 @@
           <w:rPr>
             <w:rFonts w:ascii="Cambria Math" w:eastAsiaTheme="minorEastAsia" w:hAnsi="Cambria Math"/>
           </w:rPr>
-          <m:t>=</m:t>
-        </m:r>
-        <m:r>
-          <w:rPr>
-            <w:rFonts w:ascii="Cambria Math" w:eastAsiaTheme="minorEastAsia" w:hAnsi="Cambria Math"/>
-          </w:rPr>
-          <m:t>0.5</m:t>
-        </m:r>
-        <m:r>
-          <w:rPr>
-            <w:rFonts w:ascii="Cambria Math" w:eastAsiaTheme="minorEastAsia" w:hAnsi="Cambria Math"/>
-          </w:rPr>
-          <m:t xml:space="preserve"> g</m:t>
+          <m:t>=0.5 g</m:t>
         </m:r>
       </m:oMath>
       <w:r>
         <w:rPr>
           <w:rFonts w:eastAsiaTheme="minorEastAsia"/>
         </w:rPr>
-        <w:t xml:space="preserve">, </w:t>
-      </w:r>
-      <w:r>
-        <w:rPr>
-          <w:rFonts w:eastAsiaTheme="minorEastAsia"/>
-        </w:rPr>
-        <w:t>geared</w:t>
-      </w:r>
-      <w:r>
-        <w:rPr>
-          <w:rFonts w:eastAsiaTheme="minorEastAsia"/>
-        </w:rPr>
-        <w:t xml:space="preserve"> differential</w:t>
+        <w:t>, geared differential</w:t>
       </w:r>
       <w:bookmarkEnd w:id="32"/>
     </w:p>
@@ -28320,7 +26886,7 @@
 </file>
 
 <file path=word/endnotes.xml><?xml version="1.0" encoding="utf-8"?>
-<w:endnotes xmlns:wpc="http://schemas.microsoft.com/office/word/2010/wordprocessingCanvas" xmlns:cx="http://schemas.microsoft.com/office/drawing/2014/chartex" xmlns:cx1="http://schemas.microsoft.com/office/drawing/2015/9/8/chartex" xmlns:cx2="http://schemas.microsoft.com/office/drawing/2015/10/21/chartex" xmlns:cx3="http://schemas.microsoft.com/office/drawing/2016/5/9/chartex" xmlns:cx4="http://schemas.microsoft.com/office/drawing/2016/5/10/chartex" xmlns:cx5="http://schemas.microsoft.com/office/drawing/2016/5/11/chartex" xmlns:cx6="http://schemas.microsoft.com/office/drawing/2016/5/12/chartex" xmlns:cx7="http://schemas.microsoft.com/office/drawing/2016/5/13/chartex" xmlns:cx8="http://schemas.microsoft.com/office/drawing/2016/5/14/chartex" xmlns:mc="http://schemas.openxmlformats.org/markup-compatibility/2006" xmlns:aink="http://schemas.microsoft.com/office/drawing/2016/ink" xmlns:am3d="http://schemas.microsoft.com/office/drawing/2017/model3d" xmlns:o="urn:schemas-microsoft-com:office:office" xmlns:oel="http://schemas.microsoft.com/office/2019/extlst" xmlns:r="http://schemas.openxmlformats.org/officeDocument/2006/relationships" xmlns:m="http://schemas.openxmlformats.org/officeDocument/2006/math" xmlns:v="urn:schemas-microsoft-com:vml" xmlns:wp14="http://schemas.microsoft.com/office/word/2010/wordprocessingDrawing" xmlns:wp="http://schemas.openxmlformats.org/drawingml/2006/wordprocessingDrawing" xmlns:w10="urn:schemas-microsoft-com:office:word" xmlns:w="http://schemas.openxmlformats.org/wordprocessingml/2006/main" xmlns:w14="http://schemas.microsoft.com/office/word/2010/wordml" xmlns:w15="http://schemas.microsoft.com/office/word/2012/wordml" xmlns:w16cei="http://schemas.microsoft.com/office/word/2026/wordml/cei" xmlns:w16cex="http://schemas.microsoft.com/office/word/2018/wordml/cex" xmlns:w16cid="http://schemas.microsoft.com/office/word/2016/wordml/cid" xmlns:w16="http://schemas.microsoft.com/office/word/2018/wordml" xmlns:w16du="http://schemas.microsoft.com/office/word/2023/wordml/word16du" xmlns:w16sdtdh="http://schemas.microsoft.com/office/word/2020/wordml/sdtdatahash" xmlns:w16sdtfl="http://schemas.microsoft.com/office/word/2024/wordml/sdtformatlock" xmlns:w16se="http://schemas.microsoft.com/office/word/2015/wordml/symex" xmlns:wpg="http://schemas.microsoft.com/office/word/2010/wordprocessingGroup" xmlns:wpi="http://schemas.microsoft.com/office/word/2010/wordprocessingInk" xmlns:wne="http://schemas.microsoft.com/office/word/2006/wordml" xmlns:wps="http://schemas.microsoft.com/office/word/2010/wordprocessingShape" mc:Ignorable="w14 w15 w16se w16cid w16 w16cex w16sdtdh w16sdtfl w16du wp14">
+<w:endnotes xmlns:wpc="http://schemas.microsoft.com/office/word/2010/wordprocessingCanvas" xmlns:cx="http://schemas.microsoft.com/office/drawing/2014/chartex" xmlns:cx1="http://schemas.microsoft.com/office/drawing/2015/9/8/chartex" xmlns:cx2="http://schemas.microsoft.com/office/drawing/2015/10/21/chartex" xmlns:cx3="http://schemas.microsoft.com/office/drawing/2016/5/9/chartex" xmlns:cx4="http://schemas.microsoft.com/office/drawing/2016/5/10/chartex" xmlns:cx5="http://schemas.microsoft.com/office/drawing/2016/5/11/chartex" xmlns:cx6="http://schemas.microsoft.com/office/drawing/2016/5/12/chartex" xmlns:cx7="http://schemas.microsoft.com/office/drawing/2016/5/13/chartex" xmlns:cx8="http://schemas.microsoft.com/office/drawing/2016/5/14/chartex" xmlns:mc="http://schemas.openxmlformats.org/markup-compatibility/2006" xmlns:aink="http://schemas.microsoft.com/office/drawing/2016/ink" xmlns:am3d="http://schemas.microsoft.com/office/drawing/2017/model3d" xmlns:o="urn:schemas-microsoft-com:office:office" xmlns:oel="http://schemas.microsoft.com/office/2019/extlst" xmlns:r="http://schemas.openxmlformats.org/officeDocument/2006/relationships" xmlns:m="http://schemas.openxmlformats.org/officeDocument/2006/math" xmlns:v="urn:schemas-microsoft-com:vml" xmlns:wp14="http://schemas.microsoft.com/office/word/2010/wordprocessingDrawing" xmlns:wp="http://schemas.openxmlformats.org/drawingml/2006/wordprocessingDrawing" xmlns:w10="urn:schemas-microsoft-com:office:word" xmlns:w="http://schemas.openxmlformats.org/wordprocessingml/2006/main" xmlns:w14="http://schemas.microsoft.com/office/word/2010/wordml" xmlns:w15="http://schemas.microsoft.com/office/word/2012/wordml" xmlns:w16cex="http://schemas.microsoft.com/office/word/2018/wordml/cex" xmlns:w16cid="http://schemas.microsoft.com/office/word/2016/wordml/cid" xmlns:w16="http://schemas.microsoft.com/office/word/2018/wordml" xmlns:w16du="http://schemas.microsoft.com/office/word/2023/wordml/word16du" xmlns:w16sdtdh="http://schemas.microsoft.com/office/word/2020/wordml/sdtdatahash" xmlns:w16sdtfl="http://schemas.microsoft.com/office/word/2024/wordml/sdtformatlock" xmlns:w16se="http://schemas.microsoft.com/office/word/2015/wordml/symex" xmlns:wpg="http://schemas.microsoft.com/office/word/2010/wordprocessingGroup" xmlns:wpi="http://schemas.microsoft.com/office/word/2010/wordprocessingInk" xmlns:wne="http://schemas.microsoft.com/office/word/2006/wordml" xmlns:wps="http://schemas.microsoft.com/office/word/2010/wordprocessingShape" mc:Ignorable="w14 w15 w16se w16cid w16 w16cex w16sdtdh w16sdtfl w16du wp14">
   <w:endnote w:type="separator" w:id="-1">
     <w:p>
       <w:pPr>
@@ -28345,7 +26911,7 @@
 </file>
 
 <file path=word/footnotes.xml><?xml version="1.0" encoding="utf-8"?>
-<w:footnotes xmlns:wpc="http://schemas.microsoft.com/office/word/2010/wordprocessingCanvas" xmlns:cx="http://schemas.microsoft.com/office/drawing/2014/chartex" xmlns:cx1="http://schemas.microsoft.com/office/drawing/2015/9/8/chartex" xmlns:cx2="http://schemas.microsoft.com/office/drawing/2015/10/21/chartex" xmlns:cx3="http://schemas.microsoft.com/office/drawing/2016/5/9/chartex" xmlns:cx4="http://schemas.microsoft.com/office/drawing/2016/5/10/chartex" xmlns:cx5="http://schemas.microsoft.com/office/drawing/2016/5/11/chartex" xmlns:cx6="http://schemas.microsoft.com/office/drawing/2016/5/12/chartex" xmlns:cx7="http://schemas.microsoft.com/office/drawing/2016/5/13/chartex" xmlns:cx8="http://schemas.microsoft.com/office/drawing/2016/5/14/chartex" xmlns:mc="http://schemas.openxmlformats.org/markup-compatibility/2006" xmlns:aink="http://schemas.microsoft.com/office/drawing/2016/ink" xmlns:am3d="http://schemas.microsoft.com/office/drawing/2017/model3d" xmlns:o="urn:schemas-microsoft-com:office:office" xmlns:oel="http://schemas.microsoft.com/office/2019/extlst" xmlns:r="http://schemas.openxmlformats.org/officeDocument/2006/relationships" xmlns:m="http://schemas.openxmlformats.org/officeDocument/2006/math" xmlns:v="urn:schemas-microsoft-com:vml" xmlns:wp14="http://schemas.microsoft.com/office/word/2010/wordprocessingDrawing" xmlns:wp="http://schemas.openxmlformats.org/drawingml/2006/wordprocessingDrawing" xmlns:w10="urn:schemas-microsoft-com:office:word" xmlns:w="http://schemas.openxmlformats.org/wordprocessingml/2006/main" xmlns:w14="http://schemas.microsoft.com/office/word/2010/wordml" xmlns:w15="http://schemas.microsoft.com/office/word/2012/wordml" xmlns:w16cei="http://schemas.microsoft.com/office/word/2026/wordml/cei" xmlns:w16cex="http://schemas.microsoft.com/office/word/2018/wordml/cex" xmlns:w16cid="http://schemas.microsoft.com/office/word/2016/wordml/cid" xmlns:w16="http://schemas.microsoft.com/office/word/2018/wordml" xmlns:w16du="http://schemas.microsoft.com/office/word/2023/wordml/word16du" xmlns:w16sdtdh="http://schemas.microsoft.com/office/word/2020/wordml/sdtdatahash" xmlns:w16sdtfl="http://schemas.microsoft.com/office/word/2024/wordml/sdtformatlock" xmlns:w16se="http://schemas.microsoft.com/office/word/2015/wordml/symex" xmlns:wpg="http://schemas.microsoft.com/office/word/2010/wordprocessingGroup" xmlns:wpi="http://schemas.microsoft.com/office/word/2010/wordprocessingInk" xmlns:wne="http://schemas.microsoft.com/office/word/2006/wordml" xmlns:wps="http://schemas.microsoft.com/office/word/2010/wordprocessingShape" mc:Ignorable="w14 w15 w16se w16cid w16 w16cex w16sdtdh w16sdtfl w16du wp14">
+<w:footnotes xmlns:wpc="http://schemas.microsoft.com/office/word/2010/wordprocessingCanvas" xmlns:cx="http://schemas.microsoft.com/office/drawing/2014/chartex" xmlns:cx1="http://schemas.microsoft.com/office/drawing/2015/9/8/chartex" xmlns:cx2="http://schemas.microsoft.com/office/drawing/2015/10/21/chartex" xmlns:cx3="http://schemas.microsoft.com/office/drawing/2016/5/9/chartex" xmlns:cx4="http://schemas.microsoft.com/office/drawing/2016/5/10/chartex" xmlns:cx5="http://schemas.microsoft.com/office/drawing/2016/5/11/chartex" xmlns:cx6="http://schemas.microsoft.com/office/drawing/2016/5/12/chartex" xmlns:cx7="http://schemas.microsoft.com/office/drawing/2016/5/13/chartex" xmlns:cx8="http://schemas.microsoft.com/office/drawing/2016/5/14/chartex" xmlns:mc="http://schemas.openxmlformats.org/markup-compatibility/2006" xmlns:aink="http://schemas.microsoft.com/office/drawing/2016/ink" xmlns:am3d="http://schemas.microsoft.com/office/drawing/2017/model3d" xmlns:o="urn:schemas-microsoft-com:office:office" xmlns:oel="http://schemas.microsoft.com/office/2019/extlst" xmlns:r="http://schemas.openxmlformats.org/officeDocument/2006/relationships" xmlns:m="http://schemas.openxmlformats.org/officeDocument/2006/math" xmlns:v="urn:schemas-microsoft-com:vml" xmlns:wp14="http://schemas.microsoft.com/office/word/2010/wordprocessingDrawing" xmlns:wp="http://schemas.openxmlformats.org/drawingml/2006/wordprocessingDrawing" xmlns:w10="urn:schemas-microsoft-com:office:word" xmlns:w="http://schemas.openxmlformats.org/wordprocessingml/2006/main" xmlns:w14="http://schemas.microsoft.com/office/word/2010/wordml" xmlns:w15="http://schemas.microsoft.com/office/word/2012/wordml" xmlns:w16cex="http://schemas.microsoft.com/office/word/2018/wordml/cex" xmlns:w16cid="http://schemas.microsoft.com/office/word/2016/wordml/cid" xmlns:w16="http://schemas.microsoft.com/office/word/2018/wordml" xmlns:w16du="http://schemas.microsoft.com/office/word/2023/wordml/word16du" xmlns:w16sdtdh="http://schemas.microsoft.com/office/word/2020/wordml/sdtdatahash" xmlns:w16sdtfl="http://schemas.microsoft.com/office/word/2024/wordml/sdtformatlock" xmlns:w16se="http://schemas.microsoft.com/office/word/2015/wordml/symex" xmlns:wpg="http://schemas.microsoft.com/office/word/2010/wordprocessingGroup" xmlns:wpi="http://schemas.microsoft.com/office/word/2010/wordprocessingInk" xmlns:wne="http://schemas.microsoft.com/office/word/2006/wordml" xmlns:wps="http://schemas.microsoft.com/office/word/2010/wordprocessingShape" mc:Ignorable="w14 w15 w16se w16cid w16 w16cex w16sdtdh w16sdtfl w16du wp14">
   <w:footnote w:type="separator" w:id="-1">
     <w:p>
       <w:pPr>
@@ -28371,7 +26937,7 @@
 </file>
 
 <file path=word/header1.xml><?xml version="1.0" encoding="utf-8"?>
-<w:hdr xmlns:wpc="http://schemas.microsoft.com/office/word/2010/wordprocessingCanvas" xmlns:cx="http://schemas.microsoft.com/office/drawing/2014/chartex" xmlns:cx1="http://schemas.microsoft.com/office/drawing/2015/9/8/chartex" xmlns:cx2="http://schemas.microsoft.com/office/drawing/2015/10/21/chartex" xmlns:cx3="http://schemas.microsoft.com/office/drawing/2016/5/9/chartex" xmlns:cx4="http://schemas.microsoft.com/office/drawing/2016/5/10/chartex" xmlns:cx5="http://schemas.microsoft.com/office/drawing/2016/5/11/chartex" xmlns:cx6="http://schemas.microsoft.com/office/drawing/2016/5/12/chartex" xmlns:cx7="http://schemas.microsoft.com/office/drawing/2016/5/13/chartex" xmlns:cx8="http://schemas.microsoft.com/office/drawing/2016/5/14/chartex" xmlns:mc="http://schemas.openxmlformats.org/markup-compatibility/2006" xmlns:aink="http://schemas.microsoft.com/office/drawing/2016/ink" xmlns:am3d="http://schemas.microsoft.com/office/drawing/2017/model3d" xmlns:o="urn:schemas-microsoft-com:office:office" xmlns:oel="http://schemas.microsoft.com/office/2019/extlst" xmlns:r="http://schemas.openxmlformats.org/officeDocument/2006/relationships" xmlns:m="http://schemas.openxmlformats.org/officeDocument/2006/math" xmlns:v="urn:schemas-microsoft-com:vml" xmlns:wp14="http://schemas.microsoft.com/office/word/2010/wordprocessingDrawing" xmlns:wp="http://schemas.openxmlformats.org/drawingml/2006/wordprocessingDrawing" xmlns:w10="urn:schemas-microsoft-com:office:word" xmlns:w="http://schemas.openxmlformats.org/wordprocessingml/2006/main" xmlns:w14="http://schemas.microsoft.com/office/word/2010/wordml" xmlns:w15="http://schemas.microsoft.com/office/word/2012/wordml" xmlns:w16cei="http://schemas.microsoft.com/office/word/2026/wordml/cei" xmlns:w16cex="http://schemas.microsoft.com/office/word/2018/wordml/cex" xmlns:w16cid="http://schemas.microsoft.com/office/word/2016/wordml/cid" xmlns:w16="http://schemas.microsoft.com/office/word/2018/wordml" xmlns:w16du="http://schemas.microsoft.com/office/word/2023/wordml/word16du" xmlns:w16sdtdh="http://schemas.microsoft.com/office/word/2020/wordml/sdtdatahash" xmlns:w16sdtfl="http://schemas.microsoft.com/office/word/2024/wordml/sdtformatlock" xmlns:w16se="http://schemas.microsoft.com/office/word/2015/wordml/symex" xmlns:wpg="http://schemas.microsoft.com/office/word/2010/wordprocessingGroup" xmlns:wpi="http://schemas.microsoft.com/office/word/2010/wordprocessingInk" xmlns:wne="http://schemas.microsoft.com/office/word/2006/wordml" xmlns:wps="http://schemas.microsoft.com/office/word/2010/wordprocessingShape" mc:Ignorable="w14 w15 w16se w16cid w16 w16cex w16sdtdh w16sdtfl w16du wp14">
+<w:hdr xmlns:wpc="http://schemas.microsoft.com/office/word/2010/wordprocessingCanvas" xmlns:cx="http://schemas.microsoft.com/office/drawing/2014/chartex" xmlns:cx1="http://schemas.microsoft.com/office/drawing/2015/9/8/chartex" xmlns:cx2="http://schemas.microsoft.com/office/drawing/2015/10/21/chartex" xmlns:cx3="http://schemas.microsoft.com/office/drawing/2016/5/9/chartex" xmlns:cx4="http://schemas.microsoft.com/office/drawing/2016/5/10/chartex" xmlns:cx5="http://schemas.microsoft.com/office/drawing/2016/5/11/chartex" xmlns:cx6="http://schemas.microsoft.com/office/drawing/2016/5/12/chartex" xmlns:cx7="http://schemas.microsoft.com/office/drawing/2016/5/13/chartex" xmlns:cx8="http://schemas.microsoft.com/office/drawing/2016/5/14/chartex" xmlns:mc="http://schemas.openxmlformats.org/markup-compatibility/2006" xmlns:aink="http://schemas.microsoft.com/office/drawing/2016/ink" xmlns:am3d="http://schemas.microsoft.com/office/drawing/2017/model3d" xmlns:o="urn:schemas-microsoft-com:office:office" xmlns:oel="http://schemas.microsoft.com/office/2019/extlst" xmlns:r="http://schemas.openxmlformats.org/officeDocument/2006/relationships" xmlns:m="http://schemas.openxmlformats.org/officeDocument/2006/math" xmlns:v="urn:schemas-microsoft-com:vml" xmlns:wp14="http://schemas.microsoft.com/office/word/2010/wordprocessingDrawing" xmlns:wp="http://schemas.openxmlformats.org/drawingml/2006/wordprocessingDrawing" xmlns:w10="urn:schemas-microsoft-com:office:word" xmlns:w="http://schemas.openxmlformats.org/wordprocessingml/2006/main" xmlns:w14="http://schemas.microsoft.com/office/word/2010/wordml" xmlns:w15="http://schemas.microsoft.com/office/word/2012/wordml" xmlns:w16cex="http://schemas.microsoft.com/office/word/2018/wordml/cex" xmlns:w16cid="http://schemas.microsoft.com/office/word/2016/wordml/cid" xmlns:w16="http://schemas.microsoft.com/office/word/2018/wordml" xmlns:w16du="http://schemas.microsoft.com/office/word/2023/wordml/word16du" xmlns:w16sdtdh="http://schemas.microsoft.com/office/word/2020/wordml/sdtdatahash" xmlns:w16sdtfl="http://schemas.microsoft.com/office/word/2024/wordml/sdtformatlock" xmlns:w16se="http://schemas.microsoft.com/office/word/2015/wordml/symex" xmlns:wpg="http://schemas.microsoft.com/office/word/2010/wordprocessingGroup" xmlns:wpi="http://schemas.microsoft.com/office/word/2010/wordprocessingInk" xmlns:wne="http://schemas.microsoft.com/office/word/2006/wordml" xmlns:wps="http://schemas.microsoft.com/office/word/2010/wordprocessingShape" mc:Ignorable="w14 w15 w16se w16cid w16 w16cex w16sdtdh w16sdtfl w16du wp14">
   <w:p>
     <w:pPr>
       <w:pStyle w:val="Cabealho"/>
@@ -28423,7 +26989,7 @@
 </file>
 
 <file path=word/header2.xml><?xml version="1.0" encoding="utf-8"?>
-<w:hdr xmlns:wpc="http://schemas.microsoft.com/office/word/2010/wordprocessingCanvas" xmlns:cx="http://schemas.microsoft.com/office/drawing/2014/chartex" xmlns:cx1="http://schemas.microsoft.com/office/drawing/2015/9/8/chartex" xmlns:cx2="http://schemas.microsoft.com/office/drawing/2015/10/21/chartex" xmlns:cx3="http://schemas.microsoft.com/office/drawing/2016/5/9/chartex" xmlns:cx4="http://schemas.microsoft.com/office/drawing/2016/5/10/chartex" xmlns:cx5="http://schemas.microsoft.com/office/drawing/2016/5/11/chartex" xmlns:cx6="http://schemas.microsoft.com/office/drawing/2016/5/12/chartex" xmlns:cx7="http://schemas.microsoft.com/office/drawing/2016/5/13/chartex" xmlns:cx8="http://schemas.microsoft.com/office/drawing/2016/5/14/chartex" xmlns:mc="http://schemas.openxmlformats.org/markup-compatibility/2006" xmlns:aink="http://schemas.microsoft.com/office/drawing/2016/ink" xmlns:am3d="http://schemas.microsoft.com/office/drawing/2017/model3d" xmlns:o="urn:schemas-microsoft-com:office:office" xmlns:oel="http://schemas.microsoft.com/office/2019/extlst" xmlns:r="http://schemas.openxmlformats.org/officeDocument/2006/relationships" xmlns:m="http://schemas.openxmlformats.org/officeDocument/2006/math" xmlns:v="urn:schemas-microsoft-com:vml" xmlns:wp14="http://schemas.microsoft.com/office/word/2010/wordprocessingDrawing" xmlns:wp="http://schemas.openxmlformats.org/drawingml/2006/wordprocessingDrawing" xmlns:w10="urn:schemas-microsoft-com:office:word" xmlns:w="http://schemas.openxmlformats.org/wordprocessingml/2006/main" xmlns:w14="http://schemas.microsoft.com/office/word/2010/wordml" xmlns:w15="http://schemas.microsoft.com/office/word/2012/wordml" xmlns:w16cei="http://schemas.microsoft.com/office/word/2026/wordml/cei" xmlns:w16cex="http://schemas.microsoft.com/office/word/2018/wordml/cex" xmlns:w16cid="http://schemas.microsoft.com/office/word/2016/wordml/cid" xmlns:w16="http://schemas.microsoft.com/office/word/2018/wordml" xmlns:w16du="http://schemas.microsoft.com/office/word/2023/wordml/word16du" xmlns:w16sdtdh="http://schemas.microsoft.com/office/word/2020/wordml/sdtdatahash" xmlns:w16sdtfl="http://schemas.microsoft.com/office/word/2024/wordml/sdtformatlock" xmlns:w16se="http://schemas.microsoft.com/office/word/2015/wordml/symex" xmlns:wpg="http://schemas.microsoft.com/office/word/2010/wordprocessingGroup" xmlns:wpi="http://schemas.microsoft.com/office/word/2010/wordprocessingInk" xmlns:wne="http://schemas.microsoft.com/office/word/2006/wordml" xmlns:wps="http://schemas.microsoft.com/office/word/2010/wordprocessingShape" mc:Ignorable="w14 w15 w16se w16cid w16 w16cex w16sdtdh w16sdtfl w16du wp14">
+<w:hdr xmlns:wpc="http://schemas.microsoft.com/office/word/2010/wordprocessingCanvas" xmlns:cx="http://schemas.microsoft.com/office/drawing/2014/chartex" xmlns:cx1="http://schemas.microsoft.com/office/drawing/2015/9/8/chartex" xmlns:cx2="http://schemas.microsoft.com/office/drawing/2015/10/21/chartex" xmlns:cx3="http://schemas.microsoft.com/office/drawing/2016/5/9/chartex" xmlns:cx4="http://schemas.microsoft.com/office/drawing/2016/5/10/chartex" xmlns:cx5="http://schemas.microsoft.com/office/drawing/2016/5/11/chartex" xmlns:cx6="http://schemas.microsoft.com/office/drawing/2016/5/12/chartex" xmlns:cx7="http://schemas.microsoft.com/office/drawing/2016/5/13/chartex" xmlns:cx8="http://schemas.microsoft.com/office/drawing/2016/5/14/chartex" xmlns:mc="http://schemas.openxmlformats.org/markup-compatibility/2006" xmlns:aink="http://schemas.microsoft.com/office/drawing/2016/ink" xmlns:am3d="http://schemas.microsoft.com/office/drawing/2017/model3d" xmlns:o="urn:schemas-microsoft-com:office:office" xmlns:oel="http://schemas.microsoft.com/office/2019/extlst" xmlns:r="http://schemas.openxmlformats.org/officeDocument/2006/relationships" xmlns:m="http://schemas.openxmlformats.org/officeDocument/2006/math" xmlns:v="urn:schemas-microsoft-com:vml" xmlns:wp14="http://schemas.microsoft.com/office/word/2010/wordprocessingDrawing" xmlns:wp="http://schemas.openxmlformats.org/drawingml/2006/wordprocessingDrawing" xmlns:w10="urn:schemas-microsoft-com:office:word" xmlns:w="http://schemas.openxmlformats.org/wordprocessingml/2006/main" xmlns:w14="http://schemas.microsoft.com/office/word/2010/wordml" xmlns:w15="http://schemas.microsoft.com/office/word/2012/wordml" xmlns:w16cex="http://schemas.microsoft.com/office/word/2018/wordml/cex" xmlns:w16cid="http://schemas.microsoft.com/office/word/2016/wordml/cid" xmlns:w16="http://schemas.microsoft.com/office/word/2018/wordml" xmlns:w16du="http://schemas.microsoft.com/office/word/2023/wordml/word16du" xmlns:w16sdtdh="http://schemas.microsoft.com/office/word/2020/wordml/sdtdatahash" xmlns:w16sdtfl="http://schemas.microsoft.com/office/word/2024/wordml/sdtformatlock" xmlns:w16se="http://schemas.microsoft.com/office/word/2015/wordml/symex" xmlns:wpg="http://schemas.microsoft.com/office/word/2010/wordprocessingGroup" xmlns:wpi="http://schemas.microsoft.com/office/word/2010/wordprocessingInk" xmlns:wne="http://schemas.microsoft.com/office/word/2006/wordml" xmlns:wps="http://schemas.microsoft.com/office/word/2010/wordprocessingShape" mc:Ignorable="w14 w15 w16se w16cid w16 w16cex w16sdtdh w16sdtfl w16du wp14">
   <w:sdt>
     <w:sdtPr>
       <w:id w:val="138077745"/>
@@ -28495,7 +27061,7 @@
 </file>
 
 <file path=word/numbering.xml><?xml version="1.0" encoding="utf-8"?>
-<w:numbering xmlns:wpc="http://schemas.microsoft.com/office/word/2010/wordprocessingCanvas" xmlns:cx="http://schemas.microsoft.com/office/drawing/2014/chartex" xmlns:cx1="http://schemas.microsoft.com/office/drawing/2015/9/8/chartex" xmlns:cx2="http://schemas.microsoft.com/office/drawing/2015/10/21/chartex" xmlns:cx3="http://schemas.microsoft.com/office/drawing/2016/5/9/chartex" xmlns:cx4="http://schemas.microsoft.com/office/drawing/2016/5/10/chartex" xmlns:cx5="http://schemas.microsoft.com/office/drawing/2016/5/11/chartex" xmlns:cx6="http://schemas.microsoft.com/office/drawing/2016/5/12/chartex" xmlns:cx7="http://schemas.microsoft.com/office/drawing/2016/5/13/chartex" xmlns:cx8="http://schemas.microsoft.com/office/drawing/2016/5/14/chartex" xmlns:mc="http://schemas.openxmlformats.org/markup-compatibility/2006" xmlns:aink="http://schemas.microsoft.com/office/drawing/2016/ink" xmlns:am3d="http://schemas.microsoft.com/office/drawing/2017/model3d" xmlns:o="urn:schemas-microsoft-com:office:office" xmlns:oel="http://schemas.microsoft.com/office/2019/extlst" xmlns:r="http://schemas.openxmlformats.org/officeDocument/2006/relationships" xmlns:m="http://schemas.openxmlformats.org/officeDocument/2006/math" xmlns:v="urn:schemas-microsoft-com:vml" xmlns:wp14="http://schemas.microsoft.com/office/word/2010/wordprocessingDrawing" xmlns:wp="http://schemas.openxmlformats.org/drawingml/2006/wordprocessingDrawing" xmlns:w10="urn:schemas-microsoft-com:office:word" xmlns:w="http://schemas.openxmlformats.org/wordprocessingml/2006/main" xmlns:w14="http://schemas.microsoft.com/office/word/2010/wordml" xmlns:w15="http://schemas.microsoft.com/office/word/2012/wordml" xmlns:w16cei="http://schemas.microsoft.com/office/word/2026/wordml/cei" xmlns:w16cex="http://schemas.microsoft.com/office/word/2018/wordml/cex" xmlns:w16cid="http://schemas.microsoft.com/office/word/2016/wordml/cid" xmlns:w16="http://schemas.microsoft.com/office/word/2018/wordml" xmlns:w16du="http://schemas.microsoft.com/office/word/2023/wordml/word16du" xmlns:w16sdtdh="http://schemas.microsoft.com/office/word/2020/wordml/sdtdatahash" xmlns:w16sdtfl="http://schemas.microsoft.com/office/word/2024/wordml/sdtformatlock" xmlns:w16se="http://schemas.microsoft.com/office/word/2015/wordml/symex" xmlns:wpg="http://schemas.microsoft.com/office/word/2010/wordprocessingGroup" xmlns:wpi="http://schemas.microsoft.com/office/word/2010/wordprocessingInk" xmlns:wne="http://schemas.microsoft.com/office/word/2006/wordml" xmlns:wps="http://schemas.microsoft.com/office/word/2010/wordprocessingShape" mc:Ignorable="w14 w15 w16se w16cid w16 w16cex w16sdtdh w16sdtfl w16du wp14">
+<w:numbering xmlns:wpc="http://schemas.microsoft.com/office/word/2010/wordprocessingCanvas" xmlns:cx="http://schemas.microsoft.com/office/drawing/2014/chartex" xmlns:cx1="http://schemas.microsoft.com/office/drawing/2015/9/8/chartex" xmlns:cx2="http://schemas.microsoft.com/office/drawing/2015/10/21/chartex" xmlns:cx3="http://schemas.microsoft.com/office/drawing/2016/5/9/chartex" xmlns:cx4="http://schemas.microsoft.com/office/drawing/2016/5/10/chartex" xmlns:cx5="http://schemas.microsoft.com/office/drawing/2016/5/11/chartex" xmlns:cx6="http://schemas.microsoft.com/office/drawing/2016/5/12/chartex" xmlns:cx7="http://schemas.microsoft.com/office/drawing/2016/5/13/chartex" xmlns:cx8="http://schemas.microsoft.com/office/drawing/2016/5/14/chartex" xmlns:mc="http://schemas.openxmlformats.org/markup-compatibility/2006" xmlns:aink="http://schemas.microsoft.com/office/drawing/2016/ink" xmlns:am3d="http://schemas.microsoft.com/office/drawing/2017/model3d" xmlns:o="urn:schemas-microsoft-com:office:office" xmlns:oel="http://schemas.microsoft.com/office/2019/extlst" xmlns:r="http://schemas.openxmlformats.org/officeDocument/2006/relationships" xmlns:m="http://schemas.openxmlformats.org/officeDocument/2006/math" xmlns:v="urn:schemas-microsoft-com:vml" xmlns:wp14="http://schemas.microsoft.com/office/word/2010/wordprocessingDrawing" xmlns:wp="http://schemas.openxmlformats.org/drawingml/2006/wordprocessingDrawing" xmlns:w10="urn:schemas-microsoft-com:office:word" xmlns:w="http://schemas.openxmlformats.org/wordprocessingml/2006/main" xmlns:w14="http://schemas.microsoft.com/office/word/2010/wordml" xmlns:w15="http://schemas.microsoft.com/office/word/2012/wordml" xmlns:w16cex="http://schemas.microsoft.com/office/word/2018/wordml/cex" xmlns:w16cid="http://schemas.microsoft.com/office/word/2016/wordml/cid" xmlns:w16="http://schemas.microsoft.com/office/word/2018/wordml" xmlns:w16du="http://schemas.microsoft.com/office/word/2023/wordml/word16du" xmlns:w16sdtdh="http://schemas.microsoft.com/office/word/2020/wordml/sdtdatahash" xmlns:w16sdtfl="http://schemas.microsoft.com/office/word/2024/wordml/sdtformatlock" xmlns:w16se="http://schemas.microsoft.com/office/word/2015/wordml/symex" xmlns:wpg="http://schemas.microsoft.com/office/word/2010/wordprocessingGroup" xmlns:wpi="http://schemas.microsoft.com/office/word/2010/wordprocessingInk" xmlns:wne="http://schemas.microsoft.com/office/word/2006/wordml" xmlns:wps="http://schemas.microsoft.com/office/word/2010/wordprocessingShape" mc:Ignorable="w14 w15 w16se w16cid w16 w16cex w16sdtdh w16sdtfl w16du wp14">
   <w:abstractNum w:abstractNumId="0" w15:restartNumberingAfterBreak="0">
     <w:nsid w:val="05ED76C1"/>
     <w:multiLevelType w:val="multilevel"/>
@@ -33837,6 +32403,7 @@
   <w:style w:type="character" w:default="1" w:styleId="Fontepargpadro">
     <w:name w:val="Default Paragraph Font"/>
     <w:uiPriority w:val="1"/>
+    <w:semiHidden/>
     <w:unhideWhenUsed/>
   </w:style>
   <w:style w:type="table" w:default="1" w:styleId="Tabelanormal">

</xml_diff>